<commit_message>
Expand Checkpoint 5.1 README: per-run model-call/token/cost comparison and iterative-vs-fixed retrieval analysis
</commit_message>
<xml_diff>
--- a/Final_Capstone_Project/Capstone_Checkpoint_5.1/MHerrera_Capstone_Checkpoint_5_1_Worksheet.docx
+++ b/Final_Capstone_Project/Capstone_Checkpoint_5.1/MHerrera_Capstone_Checkpoint_5_1_Worksheet.docx
@@ -513,51 +513,38 @@
                 <w:sz w:val="24"/>
                 <w:szCs w:val="24"/>
               </w:rPr>
-              <w:t>Response</w:t>
-            </w:r>
-            <w:r>
-              <w:rPr>
-                <w:sz w:val="24"/>
-                <w:szCs w:val="24"/>
-              </w:rPr>
-              <w:t>:</w:t>
-            </w:r>
-          </w:p>
-          <w:p>
-            <w:pPr>
-              <w:spacing w:after="120"/>
-              <w:rPr>
-                <w:sz w:val="24"/>
-                <w:szCs w:val="24"/>
-              </w:rPr>
-            </w:pPr>
-          </w:p>
-          <w:p>
-            <w:pPr>
-              <w:spacing w:after="120"/>
-              <w:rPr>
-                <w:sz w:val="24"/>
-                <w:szCs w:val="24"/>
-              </w:rPr>
-            </w:pPr>
-          </w:p>
-          <w:p>
-            <w:pPr>
-              <w:spacing w:after="120"/>
-              <w:rPr>
-                <w:sz w:val="24"/>
-                <w:szCs w:val="24"/>
-              </w:rPr>
-            </w:pPr>
-          </w:p>
-          <w:p>
-            <w:pPr>
-              <w:spacing w:after="120"/>
-              <w:rPr>
-                <w:sz w:val="24"/>
-                <w:szCs w:val="24"/>
-              </w:rPr>
-            </w:pPr>
+              <w:t xml:space="preserve">I designed my agent-based RAG system to answer </w:t>
+            </w:r>
+            <w:r>
+              <w:rPr>
+                <w:sz w:val="24"/>
+                <w:szCs w:val="24"/>
+                <w:u w:val="single"/>
+              </w:rPr>
+              <w:t>complex questions about people, places, and topics from my Wikipedia corpus</w:t>
+            </w:r>
+            <w:r>
+              <w:rPr>
+                <w:sz w:val="24"/>
+                <w:szCs w:val="24"/>
+              </w:rPr>
+              <w:t xml:space="preserve">. The agent is intended to handle questions that require multiple retrieval actions, especially questions that require </w:t>
+            </w:r>
+            <w:r>
+              <w:rPr>
+                <w:sz w:val="24"/>
+                <w:szCs w:val="24"/>
+                <w:u w:val="single"/>
+              </w:rPr>
+              <w:t>evidence from more than one article</w:t>
+            </w:r>
+            <w:r>
+              <w:rPr>
+                <w:sz w:val="24"/>
+                <w:szCs w:val="24"/>
+              </w:rPr>
+              <w:t>, exact source text, or a decision about whether the corpus contains enough evidence to answer.</w:t>
+            </w:r>
           </w:p>
         </w:tc>
       </w:tr>
@@ -777,6 +764,75 @@
                 <w:szCs w:val="24"/>
               </w:rPr>
             </w:pPr>
+            <w:r>
+              <w:rPr>
+                <w:sz w:val="24"/>
+                <w:szCs w:val="24"/>
+              </w:rPr>
+              <w:t xml:space="preserve">I use a </w:t>
+            </w:r>
+            <w:proofErr w:type="spellStart"/>
+            <w:r>
+              <w:rPr>
+                <w:sz w:val="24"/>
+                <w:szCs w:val="24"/>
+              </w:rPr>
+              <w:t>ReAct</w:t>
+            </w:r>
+            <w:proofErr w:type="spellEnd"/>
+            <w:r>
+              <w:rPr>
+                <w:sz w:val="24"/>
+                <w:szCs w:val="24"/>
+              </w:rPr>
+              <w:t xml:space="preserve">-based agent that starts with the user's question, retrieves relevant evidence, evaluates the retrieved information, and can perform additional retrieval or </w:t>
+            </w:r>
+            <w:r>
+              <w:rPr>
+                <w:sz w:val="24"/>
+                <w:szCs w:val="24"/>
+                <w:u w:val="single"/>
+              </w:rPr>
+              <w:t>reasoning steps</w:t>
+            </w:r>
+            <w:r>
+              <w:rPr>
+                <w:sz w:val="24"/>
+                <w:szCs w:val="24"/>
+              </w:rPr>
+              <w:t xml:space="preserve"> before generating an answer. The workflow uses retrieval tools, a set of </w:t>
+            </w:r>
+            <w:r>
+              <w:rPr>
+                <w:sz w:val="24"/>
+                <w:szCs w:val="24"/>
+                <w:u w:val="single"/>
+              </w:rPr>
+              <w:t>16 selected paraphrased questions</w:t>
+            </w:r>
+            <w:r>
+              <w:rPr>
+                <w:sz w:val="24"/>
+                <w:szCs w:val="24"/>
+              </w:rPr>
+              <w:t xml:space="preserve">, and a </w:t>
+            </w:r>
+            <w:proofErr w:type="spellStart"/>
+            <w:r>
+              <w:rPr>
+                <w:sz w:val="24"/>
+                <w:szCs w:val="24"/>
+              </w:rPr>
+              <w:t>ReAct</w:t>
+            </w:r>
+            <w:proofErr w:type="spellEnd"/>
+            <w:r>
+              <w:rPr>
+                <w:sz w:val="24"/>
+                <w:szCs w:val="24"/>
+              </w:rPr>
+              <w:t xml:space="preserve"> process to guide the agent through planning, retrieval, and answer generation. For the tested Hybrid configuration, the fixed Context-Aware retriever made 16 answer calls with no planning calls, while the Agentic Dynamic system made 32 planning calls plus 16 answer calls. This shows that the agent adds an iterative reasoning layer to the fixed retrieval workflow. I tested the agent with Hybrid, Hybrid + Graph, Lexical, and Semantic retrieval configurations.</w:t>
+            </w:r>
           </w:p>
         </w:tc>
       </w:tr>
@@ -975,26 +1031,109 @@
                 <w:sz w:val="24"/>
                 <w:szCs w:val="24"/>
               </w:rPr>
-              <w:t>Summarize the results of your testing:</w:t>
-            </w:r>
-          </w:p>
-          <w:p>
-            <w:pPr>
-              <w:spacing w:after="120"/>
-              <w:rPr>
-                <w:sz w:val="24"/>
-                <w:szCs w:val="24"/>
-              </w:rPr>
-            </w:pPr>
-          </w:p>
-          <w:p>
-            <w:pPr>
-              <w:spacing w:after="120"/>
-              <w:rPr>
-                <w:sz w:val="24"/>
-                <w:szCs w:val="24"/>
-              </w:rPr>
-            </w:pPr>
+              <w:t xml:space="preserve">I evaluated </w:t>
+            </w:r>
+            <w:r>
+              <w:rPr>
+                <w:b/>
+                <w:bCs/>
+                <w:sz w:val="24"/>
+                <w:szCs w:val="24"/>
+              </w:rPr>
+              <w:t>three</w:t>
+            </w:r>
+            <w:r>
+              <w:rPr>
+                <w:sz w:val="24"/>
+                <w:szCs w:val="24"/>
+              </w:rPr>
+              <w:t xml:space="preserve"> representative multistep </w:t>
+            </w:r>
+            <w:r>
+              <w:rPr>
+                <w:b/>
+                <w:bCs/>
+                <w:sz w:val="24"/>
+                <w:szCs w:val="24"/>
+              </w:rPr>
+              <w:t>test cases</w:t>
+            </w:r>
+            <w:r>
+              <w:rPr>
+                <w:sz w:val="24"/>
+                <w:szCs w:val="24"/>
+              </w:rPr>
+              <w:t xml:space="preserve">: (1) an Einstein/Stilwell </w:t>
+            </w:r>
+            <w:r>
+              <w:rPr>
+                <w:sz w:val="24"/>
+                <w:szCs w:val="24"/>
+                <w:u w:val="single"/>
+              </w:rPr>
+              <w:t>comparison</w:t>
+            </w:r>
+            <w:r>
+              <w:rPr>
+                <w:sz w:val="24"/>
+                <w:szCs w:val="24"/>
+              </w:rPr>
+              <w:t xml:space="preserve"> that requires evidence from two Wikipedia articles and cross-document synthesis; (2) an </w:t>
+            </w:r>
+            <w:r>
+              <w:rPr>
+                <w:sz w:val="24"/>
+                <w:szCs w:val="24"/>
+                <w:u w:val="single"/>
+              </w:rPr>
+              <w:t>exact-quotation</w:t>
+            </w:r>
+            <w:r>
+              <w:rPr>
+                <w:sz w:val="24"/>
+                <w:szCs w:val="24"/>
+              </w:rPr>
+              <w:t xml:space="preserve"> test for the opening sentence of the '13 (2010 film)' article; and (3) an </w:t>
+            </w:r>
+            <w:r>
+              <w:rPr>
+                <w:sz w:val="24"/>
+                <w:szCs w:val="24"/>
+                <w:u w:val="single"/>
+              </w:rPr>
+              <w:t xml:space="preserve">out-of-corpus </w:t>
+            </w:r>
+            <w:r>
+              <w:rPr>
+                <w:sz w:val="24"/>
+                <w:szCs w:val="24"/>
+              </w:rPr>
+              <w:t xml:space="preserve">Mars population question that requires the system to determine whether the corpus supports an answer. Using the Hybrid configuration, the fixed Context-Aware retriever passed 10/16 questions (62%), while the </w:t>
+            </w:r>
+            <w:proofErr w:type="spellStart"/>
+            <w:r>
+              <w:rPr>
+                <w:sz w:val="24"/>
+                <w:szCs w:val="24"/>
+              </w:rPr>
+              <w:t>ReAct</w:t>
+            </w:r>
+            <w:proofErr w:type="spellEnd"/>
+            <w:r>
+              <w:rPr>
+                <w:sz w:val="24"/>
+                <w:szCs w:val="24"/>
+              </w:rPr>
+              <w:t xml:space="preserve"> agent passed 15/16 (94%), a 31-point improvement. For cross-document synthesis, the fixed system passed 0/2 and the agent passed 2/2. For quotation fidelity, the fixed system passed 0/2 and the agent passed 1/2. For out-of-corpus abstention, the fixed system passed 1/2 and the agent </w:t>
+            </w:r>
+            <w:r>
+              <w:rPr>
+                <w:sz w:val="24"/>
+                <w:szCs w:val="24"/>
+              </w:rPr>
+              <w:lastRenderedPageBreak/>
+              <w:t>passed 2/2. The agent required 48 LLM calls and 93K tokens compared with 16 answer calls and 18.2K tokens for the fixed system.</w:t>
+            </w:r>
           </w:p>
         </w:tc>
       </w:tr>
@@ -1458,6 +1597,7 @@
                 <w:sz w:val="24"/>
                 <w:szCs w:val="24"/>
               </w:rPr>
+              <w:lastRenderedPageBreak/>
               <w:t>Response:</w:t>
             </w:r>
           </w:p>
@@ -1856,6 +1996,7 @@
                 <w:sz w:val="24"/>
                 <w:szCs w:val="24"/>
               </w:rPr>
+              <w:lastRenderedPageBreak/>
               <w:t>Response:</w:t>
             </w:r>
           </w:p>
@@ -1995,7 +2136,6 @@
                 <w:sz w:val="24"/>
                 <w:szCs w:val="24"/>
               </w:rPr>
-              <w:lastRenderedPageBreak/>
               <w:t>Response:</w:t>
             </w:r>
           </w:p>
@@ -2227,6 +2367,7 @@
         <w:pStyle w:val="Heading1"/>
       </w:pPr>
       <w:r>
+        <w:lastRenderedPageBreak/>
         <w:t>Supporting Materials</w:t>
       </w:r>
     </w:p>
@@ -2481,7 +2622,6 @@
                 <w:rFonts w:ascii="Aptos" w:hAnsi="Aptos"/>
                 <w:color w:val="000000"/>
               </w:rPr>
-              <w:lastRenderedPageBreak/>
               <w:t>Screenshots or diagrams</w:t>
             </w:r>
             <w:r>
@@ -3046,31 +3186,7 @@
       <w:rPr>
         <w:rFonts w:eastAsia="Trebuchet MS"/>
       </w:rPr>
-      <w:t xml:space="preserve">MIGUEL HERRERA – SECTION B – September </w:t>
-    </w:r>
-    <w:r>
-      <w:rPr>
-        <w:rFonts w:eastAsia="Trebuchet MS"/>
-      </w:rPr>
-      <w:t>23</w:t>
-    </w:r>
-    <w:r>
-      <w:rPr>
-        <w:rFonts w:eastAsia="Trebuchet MS"/>
-      </w:rPr>
-      <w:t xml:space="preserve"> – Checkpoint </w:t>
-    </w:r>
-    <w:r>
-      <w:rPr>
-        <w:rFonts w:eastAsia="Trebuchet MS"/>
-      </w:rPr>
-      <w:t>5</w:t>
-    </w:r>
-    <w:r>
-      <w:rPr>
-        <w:rFonts w:eastAsia="Trebuchet MS"/>
-      </w:rPr>
-      <w:t>.1</w:t>
+      <w:t>MIGUEL HERRERA – SECTION B – September 23 – Checkpoint 5.1</w:t>
     </w:r>
   </w:p>
 </w:ftr>
@@ -5970,7 +6086,6 @@
   <w:style w:type="character" w:default="1" w:styleId="DefaultParagraphFont">
     <w:name w:val="Default Paragraph Font"/>
     <w:uiPriority w:val="1"/>
-    <w:semiHidden/>
     <w:unhideWhenUsed/>
   </w:style>
   <w:style w:type="table" w:default="1" w:styleId="TableNormal">

</xml_diff>

<commit_message>
Add Checkpoint 5.1 worksheet (docx update and PDF export)
</commit_message>
<xml_diff>
--- a/Final_Capstone_Project/Capstone_Checkpoint_5.1/MHerrera_Capstone_Checkpoint_5_1_Worksheet.docx
+++ b/Final_Capstone_Project/Capstone_Checkpoint_5.1/MHerrera_Capstone_Checkpoint_5_1_Worksheet.docx
@@ -335,6 +335,312 @@
         </w:pBdr>
         <w:spacing w:after="0"/>
         <w:rPr>
+          <w:rFonts w:eastAsia="Aptos"/>
+          <w:color w:val="000000"/>
+          <w:sz w:val="24"/>
+          <w:szCs w:val="24"/>
+        </w:rPr>
+      </w:pPr>
+    </w:p>
+    <w:p>
+      <w:pPr>
+        <w:pBdr>
+          <w:top w:val="nil"/>
+          <w:left w:val="nil"/>
+          <w:bottom w:val="nil"/>
+          <w:right w:val="nil"/>
+          <w:between w:val="nil"/>
+        </w:pBdr>
+        <w:spacing w:after="0"/>
+        <w:rPr>
+          <w:rFonts w:eastAsia="Aptos"/>
+          <w:color w:val="000000"/>
+          <w:sz w:val="24"/>
+          <w:szCs w:val="24"/>
+        </w:rPr>
+      </w:pPr>
+    </w:p>
+    <w:p>
+      <w:pPr>
+        <w:pBdr>
+          <w:top w:val="nil"/>
+          <w:left w:val="nil"/>
+          <w:bottom w:val="nil"/>
+          <w:right w:val="nil"/>
+          <w:between w:val="nil"/>
+        </w:pBdr>
+        <w:spacing w:after="0"/>
+        <w:rPr>
+          <w:rFonts w:eastAsia="Aptos"/>
+          <w:color w:val="000000"/>
+          <w:sz w:val="24"/>
+          <w:szCs w:val="24"/>
+        </w:rPr>
+      </w:pPr>
+    </w:p>
+    <w:p>
+      <w:pPr>
+        <w:pBdr>
+          <w:top w:val="nil"/>
+          <w:left w:val="nil"/>
+          <w:bottom w:val="nil"/>
+          <w:right w:val="nil"/>
+          <w:between w:val="nil"/>
+        </w:pBdr>
+        <w:spacing w:after="0"/>
+        <w:rPr>
+          <w:rFonts w:eastAsia="Aptos"/>
+          <w:color w:val="000000"/>
+          <w:sz w:val="24"/>
+          <w:szCs w:val="24"/>
+        </w:rPr>
+      </w:pPr>
+    </w:p>
+    <w:p>
+      <w:pPr>
+        <w:pBdr>
+          <w:top w:val="nil"/>
+          <w:left w:val="nil"/>
+          <w:bottom w:val="nil"/>
+          <w:right w:val="nil"/>
+          <w:between w:val="nil"/>
+        </w:pBdr>
+        <w:spacing w:after="0"/>
+        <w:rPr>
+          <w:rFonts w:eastAsia="Aptos"/>
+          <w:color w:val="000000"/>
+          <w:sz w:val="24"/>
+          <w:szCs w:val="24"/>
+        </w:rPr>
+      </w:pPr>
+    </w:p>
+    <w:p>
+      <w:pPr>
+        <w:pBdr>
+          <w:top w:val="nil"/>
+          <w:left w:val="nil"/>
+          <w:bottom w:val="nil"/>
+          <w:right w:val="nil"/>
+          <w:between w:val="nil"/>
+        </w:pBdr>
+        <w:spacing w:after="0"/>
+        <w:rPr>
+          <w:rFonts w:eastAsia="Aptos"/>
+          <w:color w:val="000000"/>
+          <w:sz w:val="24"/>
+          <w:szCs w:val="24"/>
+        </w:rPr>
+      </w:pPr>
+    </w:p>
+    <w:p>
+      <w:pPr>
+        <w:pBdr>
+          <w:top w:val="nil"/>
+          <w:left w:val="nil"/>
+          <w:bottom w:val="nil"/>
+          <w:right w:val="nil"/>
+          <w:between w:val="nil"/>
+        </w:pBdr>
+        <w:spacing w:after="0"/>
+        <w:rPr>
+          <w:rFonts w:eastAsia="Aptos"/>
+          <w:color w:val="000000"/>
+          <w:sz w:val="24"/>
+          <w:szCs w:val="24"/>
+        </w:rPr>
+      </w:pPr>
+    </w:p>
+    <w:p>
+      <w:pPr>
+        <w:pBdr>
+          <w:top w:val="nil"/>
+          <w:left w:val="nil"/>
+          <w:bottom w:val="nil"/>
+          <w:right w:val="nil"/>
+          <w:between w:val="nil"/>
+        </w:pBdr>
+        <w:spacing w:after="0"/>
+        <w:rPr>
+          <w:rFonts w:eastAsia="Aptos"/>
+          <w:color w:val="000000"/>
+          <w:sz w:val="24"/>
+          <w:szCs w:val="24"/>
+        </w:rPr>
+      </w:pPr>
+    </w:p>
+    <w:p>
+      <w:pPr>
+        <w:pBdr>
+          <w:top w:val="nil"/>
+          <w:left w:val="nil"/>
+          <w:bottom w:val="nil"/>
+          <w:right w:val="nil"/>
+          <w:between w:val="nil"/>
+        </w:pBdr>
+        <w:spacing w:after="0"/>
+        <w:rPr>
+          <w:rFonts w:eastAsia="Aptos"/>
+          <w:color w:val="000000"/>
+          <w:sz w:val="24"/>
+          <w:szCs w:val="24"/>
+        </w:rPr>
+      </w:pPr>
+    </w:p>
+    <w:p>
+      <w:pPr>
+        <w:pBdr>
+          <w:top w:val="nil"/>
+          <w:left w:val="nil"/>
+          <w:bottom w:val="nil"/>
+          <w:right w:val="nil"/>
+          <w:between w:val="nil"/>
+        </w:pBdr>
+        <w:spacing w:after="0"/>
+        <w:rPr>
+          <w:rFonts w:eastAsia="Aptos"/>
+          <w:color w:val="000000"/>
+          <w:sz w:val="24"/>
+          <w:szCs w:val="24"/>
+        </w:rPr>
+      </w:pPr>
+    </w:p>
+    <w:p>
+      <w:pPr>
+        <w:pBdr>
+          <w:top w:val="nil"/>
+          <w:left w:val="nil"/>
+          <w:bottom w:val="nil"/>
+          <w:right w:val="nil"/>
+          <w:between w:val="nil"/>
+        </w:pBdr>
+        <w:spacing w:after="0"/>
+        <w:rPr>
+          <w:rFonts w:eastAsia="Aptos"/>
+          <w:color w:val="000000"/>
+          <w:sz w:val="24"/>
+          <w:szCs w:val="24"/>
+        </w:rPr>
+      </w:pPr>
+    </w:p>
+    <w:p>
+      <w:pPr>
+        <w:pBdr>
+          <w:top w:val="nil"/>
+          <w:left w:val="nil"/>
+          <w:bottom w:val="nil"/>
+          <w:right w:val="nil"/>
+          <w:between w:val="nil"/>
+        </w:pBdr>
+        <w:spacing w:after="0"/>
+        <w:rPr>
+          <w:rFonts w:eastAsia="Aptos"/>
+          <w:color w:val="000000"/>
+          <w:sz w:val="24"/>
+          <w:szCs w:val="24"/>
+        </w:rPr>
+      </w:pPr>
+    </w:p>
+    <w:p>
+      <w:pPr>
+        <w:pBdr>
+          <w:top w:val="nil"/>
+          <w:left w:val="nil"/>
+          <w:bottom w:val="nil"/>
+          <w:right w:val="nil"/>
+          <w:between w:val="nil"/>
+        </w:pBdr>
+        <w:spacing w:after="0"/>
+        <w:rPr>
+          <w:rFonts w:eastAsia="Aptos"/>
+          <w:color w:val="000000"/>
+          <w:sz w:val="24"/>
+          <w:szCs w:val="24"/>
+        </w:rPr>
+      </w:pPr>
+    </w:p>
+    <w:p>
+      <w:pPr>
+        <w:pBdr>
+          <w:top w:val="nil"/>
+          <w:left w:val="nil"/>
+          <w:bottom w:val="nil"/>
+          <w:right w:val="nil"/>
+          <w:between w:val="nil"/>
+        </w:pBdr>
+        <w:spacing w:after="0"/>
+        <w:rPr>
+          <w:rFonts w:eastAsia="Aptos"/>
+          <w:color w:val="000000"/>
+          <w:sz w:val="24"/>
+          <w:szCs w:val="24"/>
+        </w:rPr>
+      </w:pPr>
+    </w:p>
+    <w:p>
+      <w:pPr>
+        <w:pBdr>
+          <w:top w:val="nil"/>
+          <w:left w:val="nil"/>
+          <w:bottom w:val="nil"/>
+          <w:right w:val="nil"/>
+          <w:between w:val="nil"/>
+        </w:pBdr>
+        <w:spacing w:after="0"/>
+        <w:rPr>
+          <w:rFonts w:eastAsia="Aptos"/>
+          <w:color w:val="000000"/>
+          <w:sz w:val="24"/>
+          <w:szCs w:val="24"/>
+        </w:rPr>
+      </w:pPr>
+    </w:p>
+    <w:p>
+      <w:pPr>
+        <w:pBdr>
+          <w:top w:val="nil"/>
+          <w:left w:val="nil"/>
+          <w:bottom w:val="nil"/>
+          <w:right w:val="nil"/>
+          <w:between w:val="nil"/>
+        </w:pBdr>
+        <w:spacing w:after="0"/>
+        <w:rPr>
+          <w:rFonts w:eastAsia="Aptos"/>
+          <w:color w:val="000000"/>
+          <w:sz w:val="24"/>
+          <w:szCs w:val="24"/>
+        </w:rPr>
+      </w:pPr>
+    </w:p>
+    <w:p>
+      <w:pPr>
+        <w:pBdr>
+          <w:top w:val="nil"/>
+          <w:left w:val="nil"/>
+          <w:bottom w:val="nil"/>
+          <w:right w:val="nil"/>
+          <w:between w:val="nil"/>
+        </w:pBdr>
+        <w:spacing w:after="0"/>
+        <w:rPr>
+          <w:rFonts w:eastAsia="Aptos"/>
+          <w:color w:val="000000"/>
+          <w:sz w:val="24"/>
+          <w:szCs w:val="24"/>
+        </w:rPr>
+      </w:pPr>
+    </w:p>
+    <w:p>
+      <w:pPr>
+        <w:pBdr>
+          <w:top w:val="nil"/>
+          <w:left w:val="nil"/>
+          <w:bottom w:val="nil"/>
+          <w:right w:val="nil"/>
+          <w:between w:val="nil"/>
+        </w:pBdr>
+        <w:spacing w:after="0"/>
+        <w:rPr>
           <w:rFonts w:ascii="Calibri" w:hAnsi="Calibri" w:cs="Calibri"/>
           <w:b/>
           <w:bCs/>
@@ -352,6 +658,7 @@
           <w:sz w:val="32"/>
           <w:szCs w:val="32"/>
         </w:rPr>
+        <w:lastRenderedPageBreak/>
         <w:t xml:space="preserve">Step </w:t>
       </w:r>
       <w:r>
@@ -561,42 +868,6 @@
         </w:rPr>
       </w:pPr>
     </w:p>
-    <w:p>
-      <w:pPr>
-        <w:rPr>
-          <w:rFonts w:ascii="Calibri" w:hAnsi="Calibri" w:cs="Calibri"/>
-          <w:b/>
-          <w:bCs/>
-          <w:color w:val="A21F34"/>
-          <w:sz w:val="32"/>
-          <w:szCs w:val="32"/>
-        </w:rPr>
-      </w:pPr>
-    </w:p>
-    <w:p>
-      <w:pPr>
-        <w:rPr>
-          <w:rFonts w:ascii="Calibri" w:hAnsi="Calibri" w:cs="Calibri"/>
-          <w:b/>
-          <w:bCs/>
-          <w:color w:val="A21F34"/>
-          <w:sz w:val="32"/>
-          <w:szCs w:val="32"/>
-        </w:rPr>
-      </w:pPr>
-    </w:p>
-    <w:p>
-      <w:pPr>
-        <w:rPr>
-          <w:rFonts w:ascii="Calibri" w:hAnsi="Calibri" w:cs="Calibri"/>
-          <w:b/>
-          <w:bCs/>
-          <w:color w:val="A21F34"/>
-          <w:sz w:val="32"/>
-          <w:szCs w:val="32"/>
-        </w:rPr>
-      </w:pPr>
-    </w:p>
     <w:tbl>
       <w:tblPr>
         <w:tblW w:w="10080" w:type="dxa"/>
@@ -831,7 +1102,38 @@
                 <w:sz w:val="24"/>
                 <w:szCs w:val="24"/>
               </w:rPr>
-              <w:t xml:space="preserve"> process to guide the agent through planning, retrieval, and answer generation. For the tested Hybrid configuration, the fixed Context-Aware retriever made 16 answer calls with no planning calls, while the Agentic Dynamic system made 32 planning calls plus 16 answer calls. This shows that the agent adds an iterative reasoning layer to the fixed retrieval workflow. I tested the agent with Hybrid, Hybrid + Graph, Lexical, and Semantic retrieval configurations.</w:t>
+              <w:t xml:space="preserve"> process to guide the agent through p</w:t>
+            </w:r>
+            <w:r>
+              <w:rPr>
+                <w:sz w:val="24"/>
+                <w:szCs w:val="24"/>
+                <w:u w:val="single"/>
+              </w:rPr>
+              <w:t>lanning, retrieval, and answer generation</w:t>
+            </w:r>
+            <w:r>
+              <w:rPr>
+                <w:sz w:val="24"/>
+                <w:szCs w:val="24"/>
+              </w:rPr>
+              <w:t xml:space="preserve">. For the tested Hybrid configuration, the fixed Context-Aware retriever made 16 answer calls with no planning calls, while the Agentic Dynamic system made 32 planning calls plus 16 answer calls. This shows that the </w:t>
+            </w:r>
+            <w:r>
+              <w:rPr>
+                <w:b/>
+                <w:bCs/>
+                <w:sz w:val="24"/>
+                <w:szCs w:val="24"/>
+              </w:rPr>
+              <w:t>agent adds an iterative reasoning layer to the fixed retrieval workflow</w:t>
+            </w:r>
+            <w:r>
+              <w:rPr>
+                <w:sz w:val="24"/>
+                <w:szCs w:val="24"/>
+              </w:rPr>
+              <w:t>. I tested the agent with Hybrid, Hybrid + Graph, Lexical, and Semantic retrieval configurations.</w:t>
             </w:r>
           </w:p>
         </w:tc>
@@ -860,7 +1162,9 @@
           <w:szCs w:val="32"/>
         </w:rPr>
       </w:pPr>
-      <w:r>
+    </w:p>
+    <w:p>
+      <w:pPr>
         <w:rPr>
           <w:rFonts w:ascii="Calibri" w:hAnsi="Calibri" w:cs="Calibri"/>
           <w:b/>
@@ -869,6 +1173,53 @@
           <w:sz w:val="32"/>
           <w:szCs w:val="32"/>
         </w:rPr>
+      </w:pPr>
+    </w:p>
+    <w:p>
+      <w:pPr>
+        <w:rPr>
+          <w:rFonts w:ascii="Calibri" w:hAnsi="Calibri" w:cs="Calibri"/>
+          <w:b/>
+          <w:bCs/>
+          <w:color w:val="A21F34"/>
+          <w:sz w:val="32"/>
+          <w:szCs w:val="32"/>
+        </w:rPr>
+      </w:pPr>
+    </w:p>
+    <w:p>
+      <w:pPr>
+        <w:rPr>
+          <w:rFonts w:ascii="Calibri" w:hAnsi="Calibri" w:cs="Calibri"/>
+          <w:b/>
+          <w:bCs/>
+          <w:color w:val="A21F34"/>
+          <w:sz w:val="32"/>
+          <w:szCs w:val="32"/>
+        </w:rPr>
+      </w:pPr>
+    </w:p>
+    <w:p>
+      <w:pPr>
+        <w:rPr>
+          <w:rFonts w:ascii="Calibri" w:hAnsi="Calibri" w:cs="Calibri"/>
+          <w:b/>
+          <w:bCs/>
+          <w:color w:val="A21F34"/>
+          <w:sz w:val="32"/>
+          <w:szCs w:val="32"/>
+        </w:rPr>
+      </w:pPr>
+      <w:r>
+        <w:rPr>
+          <w:rFonts w:ascii="Calibri" w:hAnsi="Calibri" w:cs="Calibri"/>
+          <w:b/>
+          <w:bCs/>
+          <w:color w:val="A21F34"/>
+          <w:sz w:val="32"/>
+          <w:szCs w:val="32"/>
+        </w:rPr>
+        <w:lastRenderedPageBreak/>
         <w:t xml:space="preserve">Step </w:t>
       </w:r>
       <w:r>
@@ -1040,14 +1391,14 @@
                 <w:sz w:val="24"/>
                 <w:szCs w:val="24"/>
               </w:rPr>
-              <w:t>three</w:t>
-            </w:r>
-            <w:r>
-              <w:rPr>
-                <w:sz w:val="24"/>
-                <w:szCs w:val="24"/>
-              </w:rPr>
-              <w:t xml:space="preserve"> representative multistep </w:t>
+              <w:t>three representative multistep test cases</w:t>
+            </w:r>
+            <w:r>
+              <w:rPr>
+                <w:sz w:val="24"/>
+                <w:szCs w:val="24"/>
+              </w:rPr>
+              <w:t xml:space="preserve"> using the same </w:t>
             </w:r>
             <w:r>
               <w:rPr>
@@ -1056,59 +1407,14 @@
                 <w:sz w:val="24"/>
                 <w:szCs w:val="24"/>
               </w:rPr>
-              <w:t>test cases</w:t>
-            </w:r>
-            <w:r>
-              <w:rPr>
-                <w:sz w:val="24"/>
-                <w:szCs w:val="24"/>
-              </w:rPr>
-              <w:t xml:space="preserve">: (1) an Einstein/Stilwell </w:t>
-            </w:r>
-            <w:r>
-              <w:rPr>
-                <w:sz w:val="24"/>
-                <w:szCs w:val="24"/>
-                <w:u w:val="single"/>
-              </w:rPr>
-              <w:t>comparison</w:t>
-            </w:r>
-            <w:r>
-              <w:rPr>
-                <w:sz w:val="24"/>
-                <w:szCs w:val="24"/>
-              </w:rPr>
-              <w:t xml:space="preserve"> that requires evidence from two Wikipedia articles and cross-document synthesis; (2) an </w:t>
-            </w:r>
-            <w:r>
-              <w:rPr>
-                <w:sz w:val="24"/>
-                <w:szCs w:val="24"/>
-                <w:u w:val="single"/>
-              </w:rPr>
-              <w:t>exact-quotation</w:t>
-            </w:r>
-            <w:r>
-              <w:rPr>
-                <w:sz w:val="24"/>
-                <w:szCs w:val="24"/>
-              </w:rPr>
-              <w:t xml:space="preserve"> test for the opening sentence of the '13 (2010 film)' article; and (3) an </w:t>
-            </w:r>
-            <w:r>
-              <w:rPr>
-                <w:sz w:val="24"/>
-                <w:szCs w:val="24"/>
-                <w:u w:val="single"/>
-              </w:rPr>
-              <w:t xml:space="preserve">out-of-corpus </w:t>
-            </w:r>
-            <w:r>
-              <w:rPr>
-                <w:sz w:val="24"/>
-                <w:szCs w:val="24"/>
-              </w:rPr>
-              <w:t xml:space="preserve">Mars population question that requires the system to determine whether the corpus supports an answer. Using the Hybrid configuration, the fixed Context-Aware retriever passed 10/16 questions (62%), while the </w:t>
+              <w:t>16 paraphrased questions</w:t>
+            </w:r>
+            <w:r>
+              <w:rPr>
+                <w:sz w:val="24"/>
+                <w:szCs w:val="24"/>
+              </w:rPr>
+              <w:t xml:space="preserve"> for both the fixed Context-Aware retriever and the Agentic Dynamic </w:t>
             </w:r>
             <w:proofErr w:type="spellStart"/>
             <w:r>
@@ -1124,15 +1430,96 @@
                 <w:sz w:val="24"/>
                 <w:szCs w:val="24"/>
               </w:rPr>
-              <w:t xml:space="preserve"> agent passed 15/16 (94%), a 31-point improvement. For cross-document synthesis, the fixed system passed 0/2 and the agent passed 2/2. For quotation fidelity, the fixed system passed 0/2 and the agent passed 1/2. For out-of-corpus abstention, the fixed system passed 1/2 and the agent </w:t>
-            </w:r>
-            <w:r>
-              <w:rPr>
-                <w:sz w:val="24"/>
-                <w:szCs w:val="24"/>
-              </w:rPr>
-              <w:lastRenderedPageBreak/>
-              <w:t>passed 2/2. The agent required 48 LLM calls and 93K tokens compared with 16 answer calls and 18.2K tokens for the fixed system.</w:t>
+              <w:t xml:space="preserve"> retriever: </w:t>
+            </w:r>
+            <w:r>
+              <w:rPr>
+                <w:b/>
+                <w:bCs/>
+                <w:sz w:val="24"/>
+                <w:szCs w:val="24"/>
+              </w:rPr>
+              <w:t>(1)</w:t>
+            </w:r>
+            <w:r>
+              <w:rPr>
+                <w:sz w:val="24"/>
+                <w:szCs w:val="24"/>
+              </w:rPr>
+              <w:t xml:space="preserve"> an Einstein/Stilwell comparison requiring cross-document synthesis, </w:t>
+            </w:r>
+            <w:r>
+              <w:rPr>
+                <w:b/>
+                <w:bCs/>
+                <w:sz w:val="24"/>
+                <w:szCs w:val="24"/>
+              </w:rPr>
+              <w:t xml:space="preserve">(2) </w:t>
+            </w:r>
+            <w:r>
+              <w:rPr>
+                <w:sz w:val="24"/>
+                <w:szCs w:val="24"/>
+              </w:rPr>
+              <w:t xml:space="preserve">an exact-quotation request for the opening sentence of the “13 (2010 film)” article, and </w:t>
+            </w:r>
+            <w:r>
+              <w:rPr>
+                <w:b/>
+                <w:bCs/>
+                <w:sz w:val="24"/>
+                <w:szCs w:val="24"/>
+              </w:rPr>
+              <w:t xml:space="preserve">(3) </w:t>
+            </w:r>
+            <w:r>
+              <w:rPr>
+                <w:sz w:val="24"/>
+                <w:szCs w:val="24"/>
+              </w:rPr>
+              <w:t xml:space="preserve">an out-of-corpus Mars population question requiring the system to determine whether the corpus supports an answer. Using the Hybrid configuration with the tuned BM25/vector weights, the Context-Aware retriever passed 10/16 questions (62%), while the Agentic Dynamic retriever passed 15/16 (94%), a 31-percentage-point improvement. For cross-document synthesis, the Context-Aware system passed 0/2 while the agent passed 2/2. For quotation fidelity, the Context-Aware system passed 0/2 while the agent passed 1/2. For out-of-corpus abstention, the Context-Aware system passed 1/2 while the agent passed 2/2. The Context-Aware system used 16 LLM calls and 18.2K tokens, while the Agentic </w:t>
+            </w:r>
+            <w:r>
+              <w:rPr>
+                <w:b/>
+                <w:bCs/>
+                <w:sz w:val="24"/>
+                <w:szCs w:val="24"/>
+              </w:rPr>
+              <w:t>Dynamic system used 48 LLM calls</w:t>
+            </w:r>
+            <w:r>
+              <w:rPr>
+                <w:sz w:val="24"/>
+                <w:szCs w:val="24"/>
+              </w:rPr>
+              <w:t xml:space="preserve"> (32 planning and 16 answer calls) and </w:t>
+            </w:r>
+            <w:r>
+              <w:rPr>
+                <w:b/>
+                <w:bCs/>
+                <w:sz w:val="24"/>
+                <w:szCs w:val="24"/>
+              </w:rPr>
+              <w:t>93K tokens</w:t>
+            </w:r>
+            <w:r>
+              <w:rPr>
+                <w:sz w:val="24"/>
+                <w:szCs w:val="24"/>
+              </w:rPr>
+              <w:t xml:space="preserve">. These results show that </w:t>
+            </w:r>
+            <w:r>
+              <w:rPr>
+                <w:b/>
+                <w:bCs/>
+                <w:sz w:val="24"/>
+                <w:szCs w:val="24"/>
+              </w:rPr>
+              <w:t>the agent improved correctness on multistep tasks, especially cross-document synthesis, but required substantially more model calls and token usage.</w:t>
             </w:r>
           </w:p>
         </w:tc>
@@ -1216,54 +1603,74 @@
                 <w:sz w:val="24"/>
                 <w:szCs w:val="24"/>
               </w:rPr>
-              <w:t>Response:</w:t>
-            </w:r>
-          </w:p>
-          <w:p>
-            <w:pPr>
-              <w:spacing w:after="120"/>
-              <w:rPr>
-                <w:sz w:val="24"/>
-                <w:szCs w:val="24"/>
-              </w:rPr>
-            </w:pPr>
-          </w:p>
-          <w:p>
-            <w:pPr>
-              <w:spacing w:after="120"/>
-              <w:rPr>
-                <w:sz w:val="24"/>
-                <w:szCs w:val="24"/>
-              </w:rPr>
-            </w:pPr>
+              <w:t xml:space="preserve">I found that the </w:t>
+            </w:r>
+            <w:proofErr w:type="spellStart"/>
+            <w:r>
+              <w:rPr>
+                <w:sz w:val="24"/>
+                <w:szCs w:val="24"/>
+              </w:rPr>
+              <w:t>ReAct</w:t>
+            </w:r>
+            <w:proofErr w:type="spellEnd"/>
+            <w:r>
+              <w:rPr>
+                <w:sz w:val="24"/>
+                <w:szCs w:val="24"/>
+              </w:rPr>
+              <w:t xml:space="preserve"> agent was effective on the multi-step questions that required</w:t>
+            </w:r>
+            <w:r>
+              <w:rPr>
+                <w:b/>
+                <w:bCs/>
+                <w:sz w:val="24"/>
+                <w:szCs w:val="24"/>
+              </w:rPr>
+              <w:t xml:space="preserve"> retrieving and combining information</w:t>
+            </w:r>
+            <w:r>
+              <w:rPr>
+                <w:sz w:val="24"/>
+                <w:szCs w:val="24"/>
+              </w:rPr>
+              <w:t xml:space="preserve">. For the Einstein/Stilwell test, cross-document synthesis improved from 0/2 (0%) with the fixed Hybrid retriever to 2/2 (100%) with the agent. Multi-fact questions improved from 75% to 100%, and out-of-corpus abstention improved from 50% to 100%. Overall, the agent improved from 62% to 94% in the Hybrid comparison. These results show that the </w:t>
+            </w:r>
+            <w:r>
+              <w:rPr>
+                <w:sz w:val="24"/>
+                <w:szCs w:val="24"/>
+                <w:u w:val="single"/>
+              </w:rPr>
+              <w:t>agent's ability to perform iterative retrieval and reasoning was a strength</w:t>
+            </w:r>
+            <w:r>
+              <w:rPr>
+                <w:sz w:val="24"/>
+                <w:szCs w:val="24"/>
+              </w:rPr>
+              <w:t xml:space="preserve">, particularly when a question required information from multiple sources or required the system to determine whether the corpus contained </w:t>
+            </w:r>
+            <w:r>
+              <w:rPr>
+                <w:sz w:val="24"/>
+                <w:szCs w:val="24"/>
+                <w:u w:val="single"/>
+              </w:rPr>
+              <w:t>sufficient evidence</w:t>
+            </w:r>
+            <w:r>
+              <w:rPr>
+                <w:sz w:val="24"/>
+                <w:szCs w:val="24"/>
+              </w:rPr>
+              <w:t>.</w:t>
+            </w:r>
           </w:p>
         </w:tc>
       </w:tr>
     </w:tbl>
-    <w:p>
-      <w:pPr>
-        <w:rPr>
-          <w:sz w:val="24"/>
-          <w:szCs w:val="24"/>
-        </w:rPr>
-      </w:pPr>
-    </w:p>
-    <w:p>
-      <w:pPr>
-        <w:rPr>
-          <w:sz w:val="24"/>
-          <w:szCs w:val="24"/>
-        </w:rPr>
-      </w:pPr>
-    </w:p>
-    <w:p>
-      <w:pPr>
-        <w:rPr>
-          <w:sz w:val="24"/>
-          <w:szCs w:val="24"/>
-        </w:rPr>
-      </w:pPr>
-    </w:p>
     <w:p>
       <w:pPr>
         <w:rPr>
@@ -1358,30 +1765,217 @@
                 <w:sz w:val="24"/>
                 <w:szCs w:val="24"/>
               </w:rPr>
-              <w:t>Response:</w:t>
-            </w:r>
-          </w:p>
-          <w:p>
-            <w:pPr>
-              <w:spacing w:after="120"/>
-              <w:rPr>
-                <w:sz w:val="24"/>
-                <w:szCs w:val="24"/>
-              </w:rPr>
-            </w:pPr>
-          </w:p>
-          <w:p>
-            <w:pPr>
-              <w:spacing w:after="120"/>
-              <w:rPr>
-                <w:sz w:val="24"/>
-                <w:szCs w:val="24"/>
-              </w:rPr>
-            </w:pPr>
+              <w:t xml:space="preserve">I found that the </w:t>
+            </w:r>
+            <w:proofErr w:type="spellStart"/>
+            <w:r>
+              <w:rPr>
+                <w:sz w:val="24"/>
+                <w:szCs w:val="24"/>
+              </w:rPr>
+              <w:t>ReAct</w:t>
+            </w:r>
+            <w:proofErr w:type="spellEnd"/>
+            <w:r>
+              <w:rPr>
+                <w:sz w:val="24"/>
+                <w:szCs w:val="24"/>
+              </w:rPr>
+              <w:t xml:space="preserve"> agent did not improve every retrieval capability. </w:t>
+            </w:r>
+            <w:r>
+              <w:rPr>
+                <w:sz w:val="24"/>
+                <w:szCs w:val="24"/>
+                <w:u w:val="single"/>
+              </w:rPr>
+              <w:t>Exact quotation retrieval remained a weakness</w:t>
+            </w:r>
+            <w:r>
+              <w:rPr>
+                <w:sz w:val="24"/>
+                <w:szCs w:val="24"/>
+              </w:rPr>
+              <w:t xml:space="preserve">: the Hybrid agent passed only 1/2 quotation tests, so one exact quotation question still failed. The agent also required substantially </w:t>
+            </w:r>
+            <w:r>
+              <w:rPr>
+                <w:sz w:val="24"/>
+                <w:szCs w:val="24"/>
+                <w:u w:val="single"/>
+              </w:rPr>
+              <w:t>more model calls and token usage</w:t>
+            </w:r>
+            <w:r>
+              <w:rPr>
+                <w:sz w:val="24"/>
+                <w:szCs w:val="24"/>
+              </w:rPr>
+              <w:t xml:space="preserve">. In the Hybrid comparison, the agent used 48 LLM calls and 93K tokens, compared with 16 answer calls and 18.2K tokens for the fixed system. I also found that agent performance depended on the retrieval configuration. In the Semantic run, the fixed system passed 13/16 questions (81%), while the </w:t>
+            </w:r>
+            <w:proofErr w:type="spellStart"/>
+            <w:r>
+              <w:rPr>
+                <w:sz w:val="24"/>
+                <w:szCs w:val="24"/>
+              </w:rPr>
+              <w:t>ReAct</w:t>
+            </w:r>
+            <w:proofErr w:type="spellEnd"/>
+            <w:r>
+              <w:rPr>
+                <w:sz w:val="24"/>
+                <w:szCs w:val="24"/>
+              </w:rPr>
+              <w:t xml:space="preserve"> agent passed only 4/16 (25%). These results show that the agent's iterative reasoning does </w:t>
+            </w:r>
+            <w:r>
+              <w:rPr>
+                <w:sz w:val="24"/>
+                <w:szCs w:val="24"/>
+                <w:u w:val="single"/>
+              </w:rPr>
+              <w:t>not consistently</w:t>
+            </w:r>
+            <w:r>
+              <w:rPr>
+                <w:sz w:val="24"/>
+                <w:szCs w:val="24"/>
+              </w:rPr>
+              <w:t xml:space="preserve"> improve performance and can introduce higher computational costs.</w:t>
+            </w:r>
           </w:p>
         </w:tc>
       </w:tr>
     </w:tbl>
+    <w:p>
+      <w:pPr>
+        <w:rPr>
+          <w:sz w:val="24"/>
+          <w:szCs w:val="24"/>
+        </w:rPr>
+      </w:pPr>
+    </w:p>
+    <w:p>
+      <w:pPr>
+        <w:rPr>
+          <w:sz w:val="24"/>
+          <w:szCs w:val="24"/>
+        </w:rPr>
+      </w:pPr>
+    </w:p>
+    <w:p>
+      <w:pPr>
+        <w:rPr>
+          <w:sz w:val="24"/>
+          <w:szCs w:val="24"/>
+        </w:rPr>
+      </w:pPr>
+    </w:p>
+    <w:p>
+      <w:pPr>
+        <w:rPr>
+          <w:sz w:val="24"/>
+          <w:szCs w:val="24"/>
+        </w:rPr>
+      </w:pPr>
+    </w:p>
+    <w:p>
+      <w:pPr>
+        <w:rPr>
+          <w:sz w:val="24"/>
+          <w:szCs w:val="24"/>
+        </w:rPr>
+      </w:pPr>
+    </w:p>
+    <w:p>
+      <w:pPr>
+        <w:rPr>
+          <w:sz w:val="24"/>
+          <w:szCs w:val="24"/>
+        </w:rPr>
+      </w:pPr>
+    </w:p>
+    <w:p>
+      <w:pPr>
+        <w:rPr>
+          <w:sz w:val="24"/>
+          <w:szCs w:val="24"/>
+        </w:rPr>
+      </w:pPr>
+    </w:p>
+    <w:p>
+      <w:pPr>
+        <w:rPr>
+          <w:sz w:val="24"/>
+          <w:szCs w:val="24"/>
+        </w:rPr>
+      </w:pPr>
+    </w:p>
+    <w:p>
+      <w:pPr>
+        <w:rPr>
+          <w:sz w:val="24"/>
+          <w:szCs w:val="24"/>
+        </w:rPr>
+      </w:pPr>
+    </w:p>
+    <w:p>
+      <w:pPr>
+        <w:rPr>
+          <w:sz w:val="24"/>
+          <w:szCs w:val="24"/>
+        </w:rPr>
+      </w:pPr>
+    </w:p>
+    <w:p>
+      <w:pPr>
+        <w:rPr>
+          <w:sz w:val="24"/>
+          <w:szCs w:val="24"/>
+        </w:rPr>
+      </w:pPr>
+    </w:p>
+    <w:p>
+      <w:pPr>
+        <w:rPr>
+          <w:sz w:val="24"/>
+          <w:szCs w:val="24"/>
+        </w:rPr>
+      </w:pPr>
+    </w:p>
+    <w:p>
+      <w:pPr>
+        <w:rPr>
+          <w:sz w:val="24"/>
+          <w:szCs w:val="24"/>
+        </w:rPr>
+      </w:pPr>
+    </w:p>
+    <w:p>
+      <w:pPr>
+        <w:rPr>
+          <w:sz w:val="24"/>
+          <w:szCs w:val="24"/>
+        </w:rPr>
+      </w:pPr>
+    </w:p>
+    <w:p>
+      <w:pPr>
+        <w:rPr>
+          <w:sz w:val="24"/>
+          <w:szCs w:val="24"/>
+        </w:rPr>
+      </w:pPr>
+    </w:p>
+    <w:p>
+      <w:pPr>
+        <w:rPr>
+          <w:sz w:val="24"/>
+          <w:szCs w:val="24"/>
+        </w:rPr>
+      </w:pPr>
+    </w:p>
     <w:p>
       <w:pPr>
         <w:rPr>
@@ -1597,36 +2191,71 @@
                 <w:sz w:val="24"/>
                 <w:szCs w:val="24"/>
               </w:rPr>
-              <w:lastRenderedPageBreak/>
-              <w:t>Response:</w:t>
-            </w:r>
-          </w:p>
-          <w:p>
-            <w:pPr>
-              <w:spacing w:after="120"/>
-              <w:rPr>
-                <w:sz w:val="24"/>
-                <w:szCs w:val="24"/>
-              </w:rPr>
-            </w:pPr>
-          </w:p>
-          <w:p>
-            <w:pPr>
-              <w:spacing w:after="120"/>
-              <w:rPr>
-                <w:sz w:val="24"/>
-                <w:szCs w:val="24"/>
-              </w:rPr>
-            </w:pPr>
-          </w:p>
-          <w:p>
-            <w:pPr>
-              <w:spacing w:after="120"/>
-              <w:rPr>
-                <w:sz w:val="24"/>
-                <w:szCs w:val="24"/>
-              </w:rPr>
-            </w:pPr>
+              <w:t xml:space="preserve">I implemented a </w:t>
+            </w:r>
+            <w:proofErr w:type="spellStart"/>
+            <w:r>
+              <w:rPr>
+                <w:sz w:val="24"/>
+                <w:szCs w:val="24"/>
+              </w:rPr>
+              <w:t>ReAct</w:t>
+            </w:r>
+            <w:proofErr w:type="spellEnd"/>
+            <w:r>
+              <w:rPr>
+                <w:sz w:val="24"/>
+                <w:szCs w:val="24"/>
+              </w:rPr>
+              <w:t xml:space="preserve">-based agent that adds </w:t>
+            </w:r>
+            <w:r>
+              <w:rPr>
+                <w:sz w:val="24"/>
+                <w:szCs w:val="24"/>
+                <w:u w:val="single"/>
+              </w:rPr>
+              <w:t>iterative planning, retrieval, and reasoning to my fixed RAG pipeline</w:t>
+            </w:r>
+            <w:r>
+              <w:rPr>
+                <w:sz w:val="24"/>
+                <w:szCs w:val="24"/>
+              </w:rPr>
+              <w:t xml:space="preserve">. I modified the workflow so the agent can evaluate retrieved information and perform additional retrieval </w:t>
+            </w:r>
+            <w:r>
+              <w:rPr>
+                <w:b/>
+                <w:bCs/>
+                <w:sz w:val="24"/>
+                <w:szCs w:val="24"/>
+              </w:rPr>
+              <w:t>steps</w:t>
+            </w:r>
+            <w:r>
+              <w:rPr>
+                <w:sz w:val="24"/>
+                <w:szCs w:val="24"/>
+              </w:rPr>
+              <w:t xml:space="preserve"> before generating an answer. I also tested different retrieval configurations and added a Hybrid + Graph configuration with graph expansion to help connect related evidence across documents. </w:t>
+            </w:r>
+            <w:r>
+              <w:rPr>
+                <w:sz w:val="24"/>
+                <w:szCs w:val="24"/>
+                <w:u w:val="single"/>
+              </w:rPr>
+              <w:t>These changes were intended to improve the system's ability to handle multi-step questions, especially cross-document questions that require information from multiple sources</w:t>
+            </w:r>
+            <w:r>
+              <w:rPr>
+                <w:sz w:val="24"/>
+                <w:szCs w:val="24"/>
+                <w:u w:val="single"/>
+              </w:rPr>
+              <w:t>.</w:t>
+            </w:r>
           </w:p>
         </w:tc>
       </w:tr>
@@ -1702,35 +2331,69 @@
                 <w:sz w:val="24"/>
                 <w:szCs w:val="24"/>
               </w:rPr>
-              <w:t>Response:</w:t>
-            </w:r>
-          </w:p>
-          <w:p>
-            <w:pPr>
-              <w:spacing w:after="120"/>
-              <w:rPr>
-                <w:sz w:val="24"/>
-                <w:szCs w:val="24"/>
-              </w:rPr>
-            </w:pPr>
-          </w:p>
-          <w:p>
-            <w:pPr>
-              <w:spacing w:after="120"/>
-              <w:rPr>
-                <w:sz w:val="24"/>
-                <w:szCs w:val="24"/>
-              </w:rPr>
-            </w:pPr>
-          </w:p>
-          <w:p>
-            <w:pPr>
-              <w:spacing w:after="120"/>
-              <w:rPr>
-                <w:sz w:val="24"/>
-                <w:szCs w:val="24"/>
-              </w:rPr>
-            </w:pPr>
+              <w:t xml:space="preserve">I made these changes because Checkpoint 4.1 identified </w:t>
+            </w:r>
+            <w:r>
+              <w:rPr>
+                <w:sz w:val="24"/>
+                <w:szCs w:val="24"/>
+                <w:u w:val="single"/>
+              </w:rPr>
+              <w:t>cross-document synthesis as a major weakness</w:t>
+            </w:r>
+            <w:r>
+              <w:rPr>
+                <w:sz w:val="24"/>
+                <w:szCs w:val="24"/>
+              </w:rPr>
+              <w:t xml:space="preserve">, with only 3/15 tests passing (20%), and quotation fidelity at 0/15 (0%). The </w:t>
+            </w:r>
+            <w:proofErr w:type="spellStart"/>
+            <w:r>
+              <w:rPr>
+                <w:sz w:val="24"/>
+                <w:szCs w:val="24"/>
+              </w:rPr>
+              <w:t>ReAct</w:t>
+            </w:r>
+            <w:proofErr w:type="spellEnd"/>
+            <w:r>
+              <w:rPr>
+                <w:sz w:val="24"/>
+                <w:szCs w:val="24"/>
+              </w:rPr>
+              <w:t xml:space="preserve"> design was selected because it can perform additional retrieval and </w:t>
+            </w:r>
+            <w:r>
+              <w:rPr>
+                <w:sz w:val="24"/>
+                <w:szCs w:val="24"/>
+                <w:u w:val="single"/>
+              </w:rPr>
+              <w:t xml:space="preserve">reasoning steps </w:t>
+            </w:r>
+            <w:r>
+              <w:rPr>
+                <w:sz w:val="24"/>
+                <w:szCs w:val="24"/>
+              </w:rPr>
+              <w:t xml:space="preserve">instead of relying on one fixed retrieval result. The Hybrid + Graph option was also tested because </w:t>
+            </w:r>
+            <w:r>
+              <w:rPr>
+                <w:sz w:val="24"/>
+                <w:szCs w:val="24"/>
+                <w:u w:val="single"/>
+              </w:rPr>
+              <w:t>graph expansion may provide additional relationship information</w:t>
+            </w:r>
+            <w:r>
+              <w:rPr>
+                <w:sz w:val="24"/>
+                <w:szCs w:val="24"/>
+              </w:rPr>
+              <w:t xml:space="preserve"> for questions that require evidence from multiple documents.</w:t>
+            </w:r>
           </w:p>
         </w:tc>
       </w:tr>
@@ -1738,11 +2401,15 @@
     <w:p/>
     <w:p/>
     <w:p/>
+    <w:p/>
+    <w:p/>
+    <w:p/>
     <w:p>
       <w:pPr>
         <w:pStyle w:val="Heading1"/>
       </w:pPr>
       <w:r>
+        <w:lastRenderedPageBreak/>
         <w:t xml:space="preserve">Step </w:t>
       </w:r>
       <w:r>
@@ -1888,35 +2555,164 @@
                 <w:sz w:val="24"/>
                 <w:szCs w:val="24"/>
               </w:rPr>
-              <w:t>Response:</w:t>
-            </w:r>
-          </w:p>
-          <w:p>
-            <w:pPr>
-              <w:spacing w:after="120"/>
-              <w:rPr>
-                <w:sz w:val="24"/>
-                <w:szCs w:val="24"/>
-              </w:rPr>
-            </w:pPr>
-          </w:p>
-          <w:p>
-            <w:pPr>
-              <w:spacing w:after="120"/>
-              <w:rPr>
-                <w:sz w:val="24"/>
-                <w:szCs w:val="24"/>
-              </w:rPr>
-            </w:pPr>
-          </w:p>
-          <w:p>
-            <w:pPr>
-              <w:spacing w:after="120"/>
-              <w:rPr>
-                <w:sz w:val="24"/>
-                <w:szCs w:val="24"/>
-              </w:rPr>
-            </w:pPr>
+              <w:t xml:space="preserve">The initial Hybrid comparison showed a clear </w:t>
+            </w:r>
+            <w:r>
+              <w:rPr>
+                <w:sz w:val="24"/>
+                <w:szCs w:val="24"/>
+                <w:u w:val="single"/>
+              </w:rPr>
+              <w:t>improvement over the fixed baseline</w:t>
+            </w:r>
+            <w:r>
+              <w:rPr>
+                <w:sz w:val="24"/>
+                <w:szCs w:val="24"/>
+              </w:rPr>
+              <w:t xml:space="preserve">: the </w:t>
+            </w:r>
+            <w:r>
+              <w:rPr>
+                <w:b/>
+                <w:bCs/>
+                <w:sz w:val="24"/>
+                <w:szCs w:val="24"/>
+              </w:rPr>
+              <w:t>Context-Aware</w:t>
+            </w:r>
+            <w:r>
+              <w:rPr>
+                <w:sz w:val="24"/>
+                <w:szCs w:val="24"/>
+              </w:rPr>
+              <w:t xml:space="preserve"> retriever passed 10/16 questions (62%), while the </w:t>
+            </w:r>
+            <w:proofErr w:type="spellStart"/>
+            <w:r>
+              <w:rPr>
+                <w:sz w:val="24"/>
+                <w:szCs w:val="24"/>
+              </w:rPr>
+              <w:t>ReAct</w:t>
+            </w:r>
+            <w:proofErr w:type="spellEnd"/>
+            <w:r>
+              <w:rPr>
+                <w:sz w:val="24"/>
+                <w:szCs w:val="24"/>
+              </w:rPr>
+              <w:t xml:space="preserve"> agent passed 15/16 (94%). </w:t>
+            </w:r>
+            <w:r>
+              <w:rPr>
+                <w:sz w:val="24"/>
+                <w:szCs w:val="24"/>
+                <w:u w:val="single"/>
+              </w:rPr>
+              <w:t>Cross-document synthesis improved</w:t>
+            </w:r>
+            <w:r>
+              <w:rPr>
+                <w:sz w:val="24"/>
+                <w:szCs w:val="24"/>
+              </w:rPr>
+              <w:t xml:space="preserve"> from 0/2 to 2/2, </w:t>
+            </w:r>
+            <w:r>
+              <w:rPr>
+                <w:sz w:val="24"/>
+                <w:szCs w:val="24"/>
+                <w:u w:val="single"/>
+              </w:rPr>
+              <w:t>out-of-corpus abstention improved</w:t>
+            </w:r>
+            <w:r>
+              <w:rPr>
+                <w:sz w:val="24"/>
+                <w:szCs w:val="24"/>
+              </w:rPr>
+              <w:t xml:space="preserve"> from 1/2 to 2/2, and quotation fidelity improved from 0/2 to 1/2, although quotation accuracy remained a limitation. I then refined the system by adding </w:t>
+            </w:r>
+            <w:r>
+              <w:rPr>
+                <w:b/>
+                <w:bCs/>
+                <w:sz w:val="24"/>
+                <w:szCs w:val="24"/>
+              </w:rPr>
+              <w:t>Hybrid + Graph retrieval</w:t>
+            </w:r>
+            <w:r>
+              <w:rPr>
+                <w:sz w:val="24"/>
+                <w:szCs w:val="24"/>
+              </w:rPr>
+              <w:t xml:space="preserve">. In this comparison, the refined </w:t>
+            </w:r>
+            <w:proofErr w:type="spellStart"/>
+            <w:r>
+              <w:rPr>
+                <w:sz w:val="24"/>
+                <w:szCs w:val="24"/>
+              </w:rPr>
+              <w:t>ReAct</w:t>
+            </w:r>
+            <w:proofErr w:type="spellEnd"/>
+            <w:r>
+              <w:rPr>
+                <w:sz w:val="24"/>
+                <w:szCs w:val="24"/>
+              </w:rPr>
+              <w:t xml:space="preserve"> agent passed 14/16 questions (88%), compared with 9/16 (56%) for the fixed system. The refinement continued to outperform the fixed baseline and maintained strong performance on cross-document and multi-fact questions, but its overall score decreased from 94% to 88% compared with the initial </w:t>
+            </w:r>
+            <w:proofErr w:type="spellStart"/>
+            <w:r>
+              <w:rPr>
+                <w:sz w:val="24"/>
+                <w:szCs w:val="24"/>
+              </w:rPr>
+              <w:t>ReAct</w:t>
+            </w:r>
+            <w:proofErr w:type="spellEnd"/>
+            <w:r>
+              <w:rPr>
+                <w:sz w:val="24"/>
+                <w:szCs w:val="24"/>
+              </w:rPr>
+              <w:t xml:space="preserve"> agent. This shows </w:t>
+            </w:r>
+            <w:proofErr w:type="gramStart"/>
+            <w:r>
+              <w:rPr>
+                <w:sz w:val="24"/>
+                <w:szCs w:val="24"/>
+              </w:rPr>
+              <w:t>that adding</w:t>
+            </w:r>
+            <w:proofErr w:type="gramEnd"/>
+            <w:r>
+              <w:rPr>
+                <w:sz w:val="24"/>
+                <w:szCs w:val="24"/>
+              </w:rPr>
+              <w:t xml:space="preserve"> graph expansion did not further improve overall accuracy, although it continued to provide an advantage over the fixed pipeline. The main </w:t>
+            </w:r>
+            <w:r>
+              <w:rPr>
+                <w:sz w:val="24"/>
+                <w:szCs w:val="24"/>
+                <w:u w:val="single"/>
+              </w:rPr>
+              <w:t>trade-off was efficiency: the agent required substantially more LLM calls and token usage than the fixed system</w:t>
+            </w:r>
+            <w:r>
+              <w:rPr>
+                <w:sz w:val="24"/>
+                <w:szCs w:val="24"/>
+              </w:rPr>
+              <w:t>.</w:t>
+            </w:r>
           </w:p>
         </w:tc>
       </w:tr>
@@ -1996,47 +2792,101 @@
                 <w:sz w:val="24"/>
                 <w:szCs w:val="24"/>
               </w:rPr>
-              <w:lastRenderedPageBreak/>
-              <w:t>Response:</w:t>
-            </w:r>
-          </w:p>
-          <w:p>
-            <w:pPr>
-              <w:spacing w:after="120"/>
-              <w:rPr>
-                <w:sz w:val="24"/>
-                <w:szCs w:val="24"/>
-              </w:rPr>
-            </w:pPr>
-          </w:p>
-          <w:p>
-            <w:pPr>
-              <w:spacing w:after="120"/>
-              <w:rPr>
-                <w:sz w:val="24"/>
-                <w:szCs w:val="24"/>
-              </w:rPr>
-            </w:pPr>
-          </w:p>
-          <w:p>
-            <w:pPr>
-              <w:spacing w:after="120"/>
-              <w:rPr>
-                <w:sz w:val="24"/>
-                <w:szCs w:val="24"/>
-              </w:rPr>
-            </w:pPr>
+              <w:t xml:space="preserve">My initial </w:t>
+            </w:r>
+            <w:proofErr w:type="spellStart"/>
+            <w:r>
+              <w:rPr>
+                <w:sz w:val="24"/>
+                <w:szCs w:val="24"/>
+              </w:rPr>
+              <w:t>ReAct</w:t>
+            </w:r>
+            <w:proofErr w:type="spellEnd"/>
+            <w:r>
+              <w:rPr>
+                <w:sz w:val="24"/>
+                <w:szCs w:val="24"/>
+              </w:rPr>
+              <w:t xml:space="preserve"> agent used Hybrid retrieval and achieved 15/16 (94%), compared with 10/16 (62%) for the fixed pipeline. I then refined the agent by adding </w:t>
+            </w:r>
+            <w:r>
+              <w:rPr>
+                <w:sz w:val="24"/>
+                <w:szCs w:val="24"/>
+                <w:u w:val="single"/>
+              </w:rPr>
+              <w:t>Hybrid + Graph retrieval</w:t>
+            </w:r>
+            <w:r>
+              <w:rPr>
+                <w:sz w:val="24"/>
+                <w:szCs w:val="24"/>
+              </w:rPr>
+              <w:t xml:space="preserve">. In that run, the refined agent achieved 14/16 (88%), compared with 9/16 (56%) for the fixed system. </w:t>
+            </w:r>
+            <w:r>
+              <w:rPr>
+                <w:b/>
+                <w:bCs/>
+                <w:sz w:val="24"/>
+                <w:szCs w:val="24"/>
+              </w:rPr>
+              <w:t>T</w:t>
+            </w:r>
+            <w:r>
+              <w:rPr>
+                <w:b/>
+                <w:bCs/>
+                <w:sz w:val="24"/>
+                <w:szCs w:val="24"/>
+              </w:rPr>
+              <w:t>he refined agent continued to outperform the fixed baseline and maintained 100% performance on cross-document synthesis</w:t>
+            </w:r>
+            <w:r>
+              <w:rPr>
+                <w:sz w:val="24"/>
+                <w:szCs w:val="24"/>
+              </w:rPr>
+              <w:t xml:space="preserve">, but its overall score decreased from 94% to 88% compared with the initial agent. This comparison shows </w:t>
+            </w:r>
+            <w:proofErr w:type="gramStart"/>
+            <w:r>
+              <w:rPr>
+                <w:sz w:val="24"/>
+                <w:szCs w:val="24"/>
+              </w:rPr>
+              <w:t>that</w:t>
+            </w:r>
+            <w:proofErr w:type="gramEnd"/>
+            <w:r>
+              <w:rPr>
+                <w:sz w:val="24"/>
+                <w:szCs w:val="24"/>
+              </w:rPr>
+              <w:t xml:space="preserve"> adding graph expansion did not further improve overall performance and that retrieval configuration affected the agent's results. The results also suggest that the refinement should be evaluated by individual task categories, not only by overall accuracy</w:t>
+            </w:r>
+            <w:r>
+              <w:rPr>
+                <w:sz w:val="24"/>
+                <w:szCs w:val="24"/>
+              </w:rPr>
+              <w:t>.</w:t>
+            </w:r>
           </w:p>
         </w:tc>
       </w:tr>
     </w:tbl>
     <w:p/>
+    <w:p/>
+    <w:p/>
     <w:p>
       <w:pPr>
         <w:pStyle w:val="Heading1"/>
         <w:spacing w:after="0"/>
       </w:pPr>
       <w:r>
+        <w:lastRenderedPageBreak/>
         <w:t xml:space="preserve">Step </w:t>
       </w:r>
       <w:r>
@@ -2135,75 +2985,35 @@
               <w:rPr>
                 <w:sz w:val="24"/>
                 <w:szCs w:val="24"/>
-              </w:rPr>
-              <w:t>Response:</w:t>
-            </w:r>
-          </w:p>
-          <w:p>
-            <w:pPr>
-              <w:spacing w:after="120"/>
-              <w:rPr>
-                <w:sz w:val="24"/>
-                <w:szCs w:val="24"/>
-              </w:rPr>
-            </w:pPr>
-          </w:p>
-          <w:p>
-            <w:pPr>
-              <w:spacing w:after="120"/>
-              <w:rPr>
-                <w:sz w:val="24"/>
-                <w:szCs w:val="24"/>
-              </w:rPr>
-            </w:pPr>
-          </w:p>
-          <w:p>
-            <w:pPr>
-              <w:spacing w:after="120"/>
-              <w:rPr>
-                <w:sz w:val="24"/>
-                <w:szCs w:val="24"/>
-              </w:rPr>
-            </w:pPr>
-          </w:p>
-        </w:tc>
-      </w:tr>
-    </w:tbl>
-    <w:p/>
-    <w:p/>
-    <w:p/>
-    <w:tbl>
-      <w:tblPr>
-        <w:tblW w:w="10080" w:type="dxa"/>
-        <w:jc w:val="center"/>
-        <w:tblLayout w:type="fixed"/>
-        <w:tblLook w:val="0400" w:firstRow="0" w:lastRow="0" w:firstColumn="0" w:lastColumn="0" w:noHBand="0" w:noVBand="1"/>
-      </w:tblPr>
-      <w:tblGrid>
-        <w:gridCol w:w="10080"/>
-      </w:tblGrid>
-      <w:tr>
-        <w:trPr>
-          <w:jc w:val="center"/>
-        </w:trPr>
-        <w:tc>
-          <w:tcPr>
-            <w:tcW w:w="10080" w:type="dxa"/>
-            <w:tcBorders>
-              <w:top w:val="single" w:sz="6" w:space="0" w:color="BFBFBF"/>
-              <w:left w:val="single" w:sz="6" w:space="0" w:color="BFBFBF"/>
-              <w:bottom w:val="single" w:sz="6" w:space="0" w:color="BFBFBF"/>
-              <w:right w:val="single" w:sz="6" w:space="0" w:color="BFBFBF"/>
-            </w:tcBorders>
-            <w:shd w:val="clear" w:color="auto" w:fill="F2F2F2"/>
-          </w:tcPr>
-          <w:p>
-            <w:pPr>
-              <w:rPr>
-                <w:sz w:val="24"/>
-                <w:szCs w:val="24"/>
-              </w:rPr>
-            </w:pPr>
+                <w:u w:val="single"/>
+              </w:rPr>
+              <w:t xml:space="preserve">The ability of the </w:t>
+            </w:r>
+            <w:proofErr w:type="spellStart"/>
+            <w:r>
+              <w:rPr>
+                <w:sz w:val="24"/>
+                <w:szCs w:val="24"/>
+                <w:u w:val="single"/>
+              </w:rPr>
+              <w:t>ReAct</w:t>
+            </w:r>
+            <w:proofErr w:type="spellEnd"/>
+            <w:r>
+              <w:rPr>
+                <w:sz w:val="24"/>
+                <w:szCs w:val="24"/>
+                <w:u w:val="single"/>
+              </w:rPr>
+              <w:t xml:space="preserve"> agent to perform iterative retrieval and reasoning contributed most to successful task completion</w:t>
+            </w:r>
+            <w:r>
+              <w:rPr>
+                <w:sz w:val="24"/>
+                <w:szCs w:val="24"/>
+              </w:rPr>
+              <w:t xml:space="preserve">. This was especially important for the </w:t>
+            </w:r>
             <w:r>
               <w:rPr>
                 <w:b/>
@@ -2211,57 +3021,48 @@
                 <w:sz w:val="24"/>
                 <w:szCs w:val="24"/>
               </w:rPr>
-              <w:t>What limitations remain?</w:t>
-            </w:r>
-          </w:p>
-        </w:tc>
-      </w:tr>
-      <w:tr>
-        <w:trPr>
-          <w:jc w:val="center"/>
-        </w:trPr>
-        <w:tc>
-          <w:tcPr>
-            <w:tcW w:w="10080" w:type="dxa"/>
-            <w:tcBorders>
-              <w:top w:val="single" w:sz="6" w:space="0" w:color="BFBFBF"/>
-              <w:left w:val="single" w:sz="6" w:space="0" w:color="BFBFBF"/>
-              <w:bottom w:val="single" w:sz="6" w:space="0" w:color="BFBFBF"/>
-              <w:right w:val="single" w:sz="6" w:space="0" w:color="BFBFBF"/>
-            </w:tcBorders>
-          </w:tcPr>
-          <w:p>
-            <w:pPr>
-              <w:rPr>
-                <w:sz w:val="24"/>
-                <w:szCs w:val="24"/>
-              </w:rPr>
-            </w:pPr>
-            <w:r>
-              <w:rPr>
-                <w:sz w:val="24"/>
-                <w:szCs w:val="24"/>
-              </w:rPr>
-              <w:t>Response:</w:t>
-            </w:r>
-          </w:p>
-          <w:p>
-            <w:pPr>
-              <w:spacing w:after="120"/>
-              <w:rPr>
-                <w:sz w:val="24"/>
-                <w:szCs w:val="24"/>
-              </w:rPr>
-            </w:pPr>
-          </w:p>
-          <w:p>
-            <w:pPr>
-              <w:spacing w:after="120"/>
-              <w:rPr>
-                <w:sz w:val="24"/>
-                <w:szCs w:val="24"/>
-              </w:rPr>
-            </w:pPr>
+              <w:t>Einstein/Stilwell comparison</w:t>
+            </w:r>
+            <w:r>
+              <w:rPr>
+                <w:sz w:val="24"/>
+                <w:szCs w:val="24"/>
+              </w:rPr>
+              <w:t xml:space="preserve">, where the agent needed to retrieve and combine evidence from two separate Wikipedia articles. In the Hybrid configuration, </w:t>
+            </w:r>
+            <w:r>
+              <w:rPr>
+                <w:sz w:val="24"/>
+                <w:szCs w:val="24"/>
+                <w:u w:val="single"/>
+              </w:rPr>
+              <w:t xml:space="preserve">the </w:t>
+            </w:r>
+            <w:proofErr w:type="spellStart"/>
+            <w:r>
+              <w:rPr>
+                <w:sz w:val="24"/>
+                <w:szCs w:val="24"/>
+                <w:u w:val="single"/>
+              </w:rPr>
+              <w:t>ReAct</w:t>
+            </w:r>
+            <w:proofErr w:type="spellEnd"/>
+            <w:r>
+              <w:rPr>
+                <w:sz w:val="24"/>
+                <w:szCs w:val="24"/>
+                <w:u w:val="single"/>
+              </w:rPr>
+              <w:t xml:space="preserve"> agent achieved 2/2 on cross-document synthesis compared with 0/2 for the fixed system</w:t>
+            </w:r>
+            <w:r>
+              <w:rPr>
+                <w:sz w:val="24"/>
+                <w:szCs w:val="24"/>
+              </w:rPr>
+              <w:t>. This showed me that allowing the agent to perform additional retrieval and reasoning steps was particularly useful for complex, multi-step questions.</w:t>
+            </w:r>
           </w:p>
         </w:tc>
       </w:tr>
@@ -2306,7 +3107,7 @@
                 <w:sz w:val="24"/>
                 <w:szCs w:val="24"/>
               </w:rPr>
-              <w:t>What improvements would you prioritize next?</w:t>
+              <w:t>What limitations remain?</w:t>
             </w:r>
           </w:p>
         </w:tc>
@@ -2337,26 +3138,319 @@
                 <w:sz w:val="24"/>
                 <w:szCs w:val="24"/>
               </w:rPr>
-              <w:t>Response:</w:t>
+              <w:t xml:space="preserve">I still have limitations with </w:t>
+            </w:r>
+            <w:r>
+              <w:rPr>
+                <w:sz w:val="24"/>
+                <w:szCs w:val="24"/>
+                <w:u w:val="single"/>
+              </w:rPr>
+              <w:t>exact quotation retrieval</w:t>
+            </w:r>
+            <w:r>
+              <w:rPr>
+                <w:sz w:val="24"/>
+                <w:szCs w:val="24"/>
+              </w:rPr>
+              <w:t xml:space="preserve">, </w:t>
+            </w:r>
+            <w:r>
+              <w:rPr>
+                <w:sz w:val="24"/>
+                <w:szCs w:val="24"/>
+                <w:u w:val="single"/>
+              </w:rPr>
+              <w:t>retrieval efficiency</w:t>
+            </w:r>
+            <w:r>
+              <w:rPr>
+                <w:sz w:val="24"/>
+                <w:szCs w:val="24"/>
+              </w:rPr>
+              <w:t xml:space="preserve">, and consistency across retrieval configurations. In the Hybrid comparison, the agent passed only 1/2 quotation tests, and quotation fidelity remained 0/2 in the Hybrid + Graph run. The agent also required substantially more resources, using </w:t>
+            </w:r>
+            <w:r>
+              <w:rPr>
+                <w:b/>
+                <w:bCs/>
+                <w:sz w:val="24"/>
+                <w:szCs w:val="24"/>
+              </w:rPr>
+              <w:t>93K tokens</w:t>
+            </w:r>
+            <w:r>
+              <w:rPr>
+                <w:sz w:val="24"/>
+                <w:szCs w:val="24"/>
+              </w:rPr>
+              <w:t xml:space="preserve"> compared with 18.2K for the fixed Hybrid system. Performance also varied by retrieval configuration. In the Semantic comparison, the </w:t>
+            </w:r>
+            <w:proofErr w:type="spellStart"/>
+            <w:r>
+              <w:rPr>
+                <w:sz w:val="24"/>
+                <w:szCs w:val="24"/>
+              </w:rPr>
+              <w:t>ReAct</w:t>
+            </w:r>
+            <w:proofErr w:type="spellEnd"/>
+            <w:r>
+              <w:rPr>
+                <w:sz w:val="24"/>
+                <w:szCs w:val="24"/>
+              </w:rPr>
+              <w:t xml:space="preserve"> agent passed only 4/16 questions (25%), compared with 13/16 (81%) for the fixed system. These results show that iterative reasoning can improve some complex tasks, but it does not consistently overcome underlying retrieval limitations</w:t>
+            </w:r>
+            <w:r>
+              <w:rPr>
+                <w:sz w:val="24"/>
+                <w:szCs w:val="24"/>
+              </w:rPr>
+              <w:t>.</w:t>
             </w:r>
           </w:p>
+        </w:tc>
+      </w:tr>
+    </w:tbl>
+    <w:p/>
+    <w:tbl>
+      <w:tblPr>
+        <w:tblW w:w="10080" w:type="dxa"/>
+        <w:jc w:val="center"/>
+        <w:tblLayout w:type="fixed"/>
+        <w:tblLook w:val="0400" w:firstRow="0" w:lastRow="0" w:firstColumn="0" w:lastColumn="0" w:noHBand="0" w:noVBand="1"/>
+      </w:tblPr>
+      <w:tblGrid>
+        <w:gridCol w:w="10080"/>
+      </w:tblGrid>
+      <w:tr>
+        <w:trPr>
+          <w:jc w:val="center"/>
+        </w:trPr>
+        <w:tc>
+          <w:tcPr>
+            <w:tcW w:w="10080" w:type="dxa"/>
+            <w:tcBorders>
+              <w:top w:val="single" w:sz="6" w:space="0" w:color="BFBFBF"/>
+              <w:left w:val="single" w:sz="6" w:space="0" w:color="BFBFBF"/>
+              <w:bottom w:val="single" w:sz="6" w:space="0" w:color="BFBFBF"/>
+              <w:right w:val="single" w:sz="6" w:space="0" w:color="BFBFBF"/>
+            </w:tcBorders>
+            <w:shd w:val="clear" w:color="auto" w:fill="F2F2F2"/>
+          </w:tcPr>
           <w:p>
             <w:pPr>
-              <w:spacing w:after="120"/>
               <w:rPr>
                 <w:sz w:val="24"/>
                 <w:szCs w:val="24"/>
               </w:rPr>
             </w:pPr>
+            <w:r>
+              <w:rPr>
+                <w:b/>
+                <w:bCs/>
+                <w:sz w:val="24"/>
+                <w:szCs w:val="24"/>
+              </w:rPr>
+              <w:t>What improvements would you prioritize next?</w:t>
+            </w:r>
           </w:p>
+        </w:tc>
+      </w:tr>
+      <w:tr>
+        <w:trPr>
+          <w:jc w:val="center"/>
+        </w:trPr>
+        <w:tc>
+          <w:tcPr>
+            <w:tcW w:w="10080" w:type="dxa"/>
+            <w:tcBorders>
+              <w:top w:val="single" w:sz="6" w:space="0" w:color="BFBFBF"/>
+              <w:left w:val="single" w:sz="6" w:space="0" w:color="BFBFBF"/>
+              <w:bottom w:val="single" w:sz="6" w:space="0" w:color="BFBFBF"/>
+              <w:right w:val="single" w:sz="6" w:space="0" w:color="BFBFBF"/>
+            </w:tcBorders>
+          </w:tcPr>
           <w:p>
             <w:pPr>
-              <w:spacing w:after="120"/>
               <w:rPr>
                 <w:sz w:val="24"/>
                 <w:szCs w:val="24"/>
               </w:rPr>
             </w:pPr>
+            <w:r>
+              <w:rPr>
+                <w:sz w:val="24"/>
+                <w:szCs w:val="24"/>
+              </w:rPr>
+              <w:t xml:space="preserve">I would </w:t>
+            </w:r>
+            <w:r>
+              <w:rPr>
+                <w:sz w:val="24"/>
+                <w:szCs w:val="24"/>
+              </w:rPr>
+              <w:t>like to</w:t>
+            </w:r>
+            <w:r>
+              <w:rPr>
+                <w:sz w:val="24"/>
+                <w:szCs w:val="24"/>
+              </w:rPr>
+              <w:t xml:space="preserve"> evaluate and improve the </w:t>
+            </w:r>
+            <w:r>
+              <w:rPr>
+                <w:sz w:val="24"/>
+                <w:szCs w:val="24"/>
+                <w:u w:val="single"/>
+              </w:rPr>
+              <w:t xml:space="preserve">system </w:t>
+            </w:r>
+            <w:r>
+              <w:rPr>
+                <w:sz w:val="24"/>
+                <w:szCs w:val="24"/>
+                <w:u w:val="single"/>
+              </w:rPr>
+              <w:t>prompt,</w:t>
+            </w:r>
+            <w:r>
+              <w:rPr>
+                <w:sz w:val="24"/>
+                <w:szCs w:val="24"/>
+                <w:u w:val="single"/>
+              </w:rPr>
+              <w:t xml:space="preserve"> </w:t>
+            </w:r>
+            <w:r>
+              <w:rPr>
+                <w:sz w:val="24"/>
+                <w:szCs w:val="24"/>
+              </w:rPr>
+              <w:t xml:space="preserve">so the agent has </w:t>
+            </w:r>
+            <w:r>
+              <w:rPr>
+                <w:sz w:val="24"/>
+                <w:szCs w:val="24"/>
+                <w:u w:val="single"/>
+              </w:rPr>
+              <w:t>clearer guidance</w:t>
+            </w:r>
+            <w:r>
+              <w:rPr>
+                <w:sz w:val="24"/>
+                <w:szCs w:val="24"/>
+              </w:rPr>
+              <w:t xml:space="preserve"> on when to perform additional retrieval, when to change retrieval strategies, and how to evaluate retrieved evidence before answering. I would also </w:t>
+            </w:r>
+            <w:r>
+              <w:rPr>
+                <w:sz w:val="24"/>
+                <w:szCs w:val="24"/>
+              </w:rPr>
+              <w:t xml:space="preserve">like to </w:t>
+            </w:r>
+            <w:r>
+              <w:rPr>
+                <w:sz w:val="24"/>
+                <w:szCs w:val="24"/>
+              </w:rPr>
+              <w:t xml:space="preserve">improve </w:t>
+            </w:r>
+            <w:r>
+              <w:rPr>
+                <w:sz w:val="24"/>
+                <w:szCs w:val="24"/>
+                <w:u w:val="single"/>
+              </w:rPr>
+              <w:t>exact quotation retrieval</w:t>
+            </w:r>
+            <w:r>
+              <w:rPr>
+                <w:sz w:val="24"/>
+                <w:szCs w:val="24"/>
+              </w:rPr>
+              <w:t xml:space="preserve"> by verifying that the requested source exists and that the required passage is available before generating the answer. For cross-document questions, I would </w:t>
+            </w:r>
+            <w:r>
+              <w:rPr>
+                <w:sz w:val="24"/>
+                <w:szCs w:val="24"/>
+              </w:rPr>
+              <w:t xml:space="preserve">like to </w:t>
+            </w:r>
+            <w:r>
+              <w:rPr>
+                <w:sz w:val="24"/>
+                <w:szCs w:val="24"/>
+              </w:rPr>
+              <w:t xml:space="preserve">investigate more targeted </w:t>
+            </w:r>
+            <w:r>
+              <w:rPr>
+                <w:sz w:val="24"/>
+                <w:szCs w:val="24"/>
+                <w:u w:val="single"/>
+              </w:rPr>
+              <w:t>multi-hop retrieval and document-level evidence aggregation</w:t>
+            </w:r>
+            <w:r>
+              <w:rPr>
+                <w:sz w:val="24"/>
+                <w:szCs w:val="24"/>
+              </w:rPr>
+              <w:t>. Finally, I would</w:t>
+            </w:r>
+            <w:r>
+              <w:rPr>
+                <w:sz w:val="24"/>
+                <w:szCs w:val="24"/>
+              </w:rPr>
+              <w:t xml:space="preserve"> like to</w:t>
+            </w:r>
+            <w:r>
+              <w:rPr>
+                <w:sz w:val="24"/>
+                <w:szCs w:val="24"/>
+              </w:rPr>
+              <w:t xml:space="preserve"> reduce </w:t>
+            </w:r>
+            <w:r>
+              <w:rPr>
+                <w:sz w:val="24"/>
+                <w:szCs w:val="24"/>
+                <w:u w:val="single"/>
+              </w:rPr>
+              <w:t xml:space="preserve">unnecessary </w:t>
+            </w:r>
+            <w:proofErr w:type="gramStart"/>
+            <w:r>
+              <w:rPr>
+                <w:sz w:val="24"/>
+                <w:szCs w:val="24"/>
+                <w:u w:val="single"/>
+              </w:rPr>
+              <w:t>planning</w:t>
+            </w:r>
+            <w:proofErr w:type="gramEnd"/>
+            <w:r>
+              <w:rPr>
+                <w:sz w:val="24"/>
+                <w:szCs w:val="24"/>
+                <w:u w:val="single"/>
+              </w:rPr>
+              <w:t xml:space="preserve"> and retrieval calls</w:t>
+            </w:r>
+            <w:r>
+              <w:rPr>
+                <w:sz w:val="24"/>
+                <w:szCs w:val="24"/>
+              </w:rPr>
+              <w:t xml:space="preserve"> so that accuracy improvements can be achieved with lower token usage and fewer model calls.</w:t>
+            </w:r>
           </w:p>
         </w:tc>
       </w:tr>
@@ -2510,6 +3604,16 @@
                 <w:szCs w:val="24"/>
               </w:rPr>
             </w:pPr>
+            <w:hyperlink w:anchor="_Checkpoint_5.1_-" w:history="1">
+              <w:r>
+                <w:rPr>
+                  <w:rStyle w:val="Hyperlink"/>
+                  <w:sz w:val="24"/>
+                  <w:szCs w:val="24"/>
+                </w:rPr>
+                <w:t>Checkpoint 5.1 - Prompts</w:t>
+              </w:r>
+            </w:hyperlink>
           </w:p>
           <w:p>
             <w:pPr>
@@ -2518,14 +3622,13 @@
                 <w:szCs w:val="24"/>
               </w:rPr>
             </w:pPr>
-          </w:p>
-          <w:p>
-            <w:pPr>
-              <w:rPr>
-                <w:sz w:val="24"/>
-                <w:szCs w:val="24"/>
-              </w:rPr>
-            </w:pPr>
+            <w:r>
+              <w:rPr>
+                <w:sz w:val="24"/>
+                <w:szCs w:val="24"/>
+              </w:rPr>
+              <w:t>See end of this document.</w:t>
+            </w:r>
           </w:p>
         </w:tc>
       </w:tr>
@@ -2578,22 +3681,16 @@
                 <w:szCs w:val="24"/>
               </w:rPr>
             </w:pPr>
-          </w:p>
-          <w:p>
-            <w:pPr>
-              <w:rPr>
-                <w:sz w:val="24"/>
-                <w:szCs w:val="24"/>
-              </w:rPr>
-            </w:pPr>
-          </w:p>
-          <w:p>
-            <w:pPr>
-              <w:rPr>
-                <w:sz w:val="24"/>
-                <w:szCs w:val="24"/>
-              </w:rPr>
-            </w:pPr>
+            <w:hyperlink r:id="rId8" w:history="1">
+              <w:r>
+                <w:rPr>
+                  <w:rStyle w:val="Hyperlink"/>
+                  <w:sz w:val="24"/>
+                  <w:szCs w:val="24"/>
+                </w:rPr>
+                <w:t>https://github.com/miguelangelherrera77-blip/MIT_CAPSTONE/blob/main/Final_Capstone_Project/Ragas_Experiments/detailed_test_results_agentic.log</w:t>
+              </w:r>
+            </w:hyperlink>
           </w:p>
         </w:tc>
       </w:tr>
@@ -2656,6 +3753,47 @@
                 <w:szCs w:val="24"/>
               </w:rPr>
             </w:pPr>
+            <w:r>
+              <w:rPr>
+                <w:sz w:val="24"/>
+                <w:szCs w:val="24"/>
+              </w:rPr>
+              <w:drawing>
+                <wp:inline distT="0" distB="0" distL="0" distR="0" wp14:anchorId="3B69F482" wp14:editId="6AD5E4D5">
+                  <wp:extent cx="3063240" cy="1904365"/>
+                  <wp:effectExtent l="0" t="0" r="3810" b="635"/>
+                  <wp:docPr id="175614082" name="Picture 1"/>
+                  <wp:cNvGraphicFramePr>
+                    <a:graphicFrameLocks xmlns:a="http://schemas.openxmlformats.org/drawingml/2006/main" noChangeAspect="1"/>
+                  </wp:cNvGraphicFramePr>
+                  <a:graphic xmlns:a="http://schemas.openxmlformats.org/drawingml/2006/main">
+                    <a:graphicData uri="http://schemas.openxmlformats.org/drawingml/2006/picture">
+                      <pic:pic xmlns:pic="http://schemas.openxmlformats.org/drawingml/2006/picture">
+                        <pic:nvPicPr>
+                          <pic:cNvPr id="175614082" name=""/>
+                          <pic:cNvPicPr/>
+                        </pic:nvPicPr>
+                        <pic:blipFill>
+                          <a:blip r:embed="rId9"/>
+                          <a:stretch>
+                            <a:fillRect/>
+                          </a:stretch>
+                        </pic:blipFill>
+                        <pic:spPr>
+                          <a:xfrm>
+                            <a:off x="0" y="0"/>
+                            <a:ext cx="3063240" cy="1904365"/>
+                          </a:xfrm>
+                          <a:prstGeom prst="rect">
+                            <a:avLst/>
+                          </a:prstGeom>
+                        </pic:spPr>
+                      </pic:pic>
+                    </a:graphicData>
+                  </a:graphic>
+                </wp:inline>
+              </w:drawing>
+            </w:r>
           </w:p>
         </w:tc>
       </w:tr>
@@ -2718,6 +3856,16 @@
                 <w:szCs w:val="24"/>
               </w:rPr>
             </w:pPr>
+            <w:hyperlink r:id="rId10" w:history="1">
+              <w:r>
+                <w:rPr>
+                  <w:rStyle w:val="Hyperlink"/>
+                  <w:sz w:val="24"/>
+                  <w:szCs w:val="24"/>
+                </w:rPr>
+                <w:t>https://github.com/miguelangelherrera77-blip/MIT_CAPSTONE</w:t>
+              </w:r>
+            </w:hyperlink>
           </w:p>
         </w:tc>
       </w:tr>
@@ -2784,34 +3932,448 @@
                 <w:szCs w:val="24"/>
               </w:rPr>
             </w:pPr>
+            <w:hyperlink r:id="rId11" w:history="1">
+              <w:r>
+                <w:rPr>
+                  <w:rStyle w:val="Hyperlink"/>
+                  <w:sz w:val="24"/>
+                  <w:szCs w:val="24"/>
+                </w:rPr>
+                <w:t>https://github.com/miguelangelherrera77-blip/MIT_CAPSTONE</w:t>
+              </w:r>
+            </w:hyperlink>
           </w:p>
         </w:tc>
       </w:tr>
     </w:tbl>
     <w:p/>
-    <w:p>
-      <w:pPr>
-        <w:jc w:val="center"/>
-      </w:pPr>
-      <w:r>
+    <w:p/>
+    <w:p/>
+    <w:p/>
+    <w:p/>
+    <w:p>
+      <w:pPr>
         <w:rPr>
           <w:b/>
           <w:bCs/>
         </w:rPr>
-        <w:t xml:space="preserve">End of Required Capstone Checkpoint </w:t>
-      </w:r>
-      <w:r>
+      </w:pPr>
+    </w:p>
+    <w:p>
+      <w:pPr>
+        <w:pStyle w:val="Heading1"/>
+      </w:pPr>
+      <w:bookmarkStart w:id="0" w:name="_Checkpoint_5.1_-"/>
+      <w:bookmarkEnd w:id="0"/>
+      <w:r>
+        <w:lastRenderedPageBreak/>
+        <w:t>Checkpoint 5.1 - Prompts</w:t>
+      </w:r>
+    </w:p>
+    <w:p>
+      <w:pPr>
         <w:rPr>
           <w:b/>
           <w:bCs/>
         </w:rPr>
-        <w:t>5</w:t>
-      </w:r>
+      </w:pPr>
       <w:r>
         <w:rPr>
           <w:b/>
           <w:bCs/>
         </w:rPr>
+        <w:t>Planner — graph enabled (Agentic Dynamic, graph search method)</w:t>
+      </w:r>
+    </w:p>
+    <w:p>
+      <w:r>
+        <w:t>You are a research agent for a Wikipedia retrieval engine. You help the user find information about significant people, places, and topics using a search database of Wikipedia article chunks.</w:t>
+      </w:r>
+    </w:p>
+    <w:p>
+      <w:r>
+        <w:t>You are given the user's question (and prior conversation), the queries already executed, the chunks retrieved so far, and any clarifications from the user. Decide what to do next and respond with a JSON object ONLY:{  "action": "retrieve" | "</w:t>
+      </w:r>
+      <w:proofErr w:type="spellStart"/>
+      <w:r>
+        <w:t>graph_expand</w:t>
+      </w:r>
+      <w:proofErr w:type="spellEnd"/>
+      <w:r>
+        <w:t>" | "clarify" | "answer",  "queries": ["query1", "query2"],   // 1-3 NEW queries; only for action=="retrieve"; do not repeat executed ones  "clarification": "question text",    // only for action=="clarify"  "reasoning": "brief explanation"}</w:t>
+      </w:r>
+    </w:p>
+    <w:p>
+      <w:proofErr w:type="gramStart"/>
+      <w:r>
+        <w:t>Guidelines:-</w:t>
+      </w:r>
+      <w:proofErr w:type="gramEnd"/>
+      <w:r>
+        <w:t xml:space="preserve"> "retrieve": you need more information via hybrid BM25 + vector </w:t>
+      </w:r>
+      <w:proofErr w:type="gramStart"/>
+      <w:r>
+        <w:t>search.-</w:t>
+      </w:r>
+      <w:proofErr w:type="gramEnd"/>
+      <w:r>
+        <w:t xml:space="preserve"> "</w:t>
+      </w:r>
+      <w:proofErr w:type="spellStart"/>
+      <w:r>
+        <w:t>graph_expand</w:t>
+      </w:r>
+      <w:proofErr w:type="spellEnd"/>
+      <w:r>
+        <w:t xml:space="preserve">": the question needs neighboring or linked article context; expands the most relevant seed chunks with adjacent and referenced-article </w:t>
+      </w:r>
+      <w:proofErr w:type="gramStart"/>
+      <w:r>
+        <w:t>chunks.-</w:t>
+      </w:r>
+      <w:proofErr w:type="gramEnd"/>
+      <w:r>
+        <w:t xml:space="preserve"> "clarify": the message is not really a question and you must ask for more input. Use ONLY as a last resort, and only AFTER attempting to query the </w:t>
+      </w:r>
+      <w:proofErr w:type="gramStart"/>
+      <w:r>
+        <w:t>database.-</w:t>
+      </w:r>
+      <w:proofErr w:type="gramEnd"/>
+      <w:r>
+        <w:t xml:space="preserve"> "answer": you have enough information, or the user asked to exit."</w:t>
+      </w:r>
+    </w:p>
+    <w:p>
+      <w:pPr>
+        <w:pBdr>
+          <w:bottom w:val="single" w:sz="6" w:space="1" w:color="auto"/>
+        </w:pBdr>
+      </w:pPr>
+    </w:p>
+    <w:p/>
+    <w:p/>
+    <w:p/>
+    <w:p/>
+    <w:p/>
+    <w:p/>
+    <w:p/>
+    <w:p/>
+    <w:p/>
+    <w:p>
+      <w:pPr>
+        <w:rPr>
+          <w:b/>
+          <w:bCs/>
+        </w:rPr>
+      </w:pPr>
+    </w:p>
+    <w:p>
+      <w:r>
+        <w:rPr>
+          <w:b/>
+          <w:bCs/>
+        </w:rPr>
+        <w:t>Planner — graph disabled</w:t>
+      </w:r>
+      <w:r>
+        <w:t> (Agentic Dynamic, lexical/semantic/hybrid)</w:t>
+      </w:r>
+    </w:p>
+    <w:p>
+      <w:r>
+        <w:t>You are a research agent for a Wikipedia retrieval engine. You help the user find information about significant people, places, and topics using a search database of Wikipedia article chunks.</w:t>
+      </w:r>
+    </w:p>
+    <w:p>
+      <w:r>
+        <w:t xml:space="preserve">You are given the user's question (and prior conversation), the queries already executed, the chunks retrieved so far, and any clarifications from the user. Decide what to do next and respond with a JSON object </w:t>
+      </w:r>
+      <w:proofErr w:type="gramStart"/>
+      <w:r>
+        <w:t>ONLY:{</w:t>
+      </w:r>
+      <w:proofErr w:type="gramEnd"/>
+      <w:r>
+        <w:t xml:space="preserve">  "action": "retrieve" | "clarify" | "answer</w:t>
+      </w:r>
+      <w:proofErr w:type="gramStart"/>
+      <w:r>
+        <w:t>",  "</w:t>
+      </w:r>
+      <w:proofErr w:type="gramEnd"/>
+      <w:r>
+        <w:t>queries": ["query1", "query2"</w:t>
+      </w:r>
+      <w:proofErr w:type="gramStart"/>
+      <w:r>
+        <w:t xml:space="preserve">],   </w:t>
+      </w:r>
+      <w:proofErr w:type="gramEnd"/>
+      <w:r>
+        <w:t xml:space="preserve">// 1-3 NEW queries; only for action=="retrieve"; do not repeat executed </w:t>
+      </w:r>
+      <w:proofErr w:type="gramStart"/>
+      <w:r>
+        <w:t>ones  "</w:t>
+      </w:r>
+      <w:proofErr w:type="gramEnd"/>
+      <w:r>
+        <w:t>clarification": "question text</w:t>
+      </w:r>
+      <w:proofErr w:type="gramStart"/>
+      <w:r>
+        <w:t xml:space="preserve">",   </w:t>
+      </w:r>
+      <w:proofErr w:type="gramEnd"/>
+      <w:r>
+        <w:t xml:space="preserve"> // only for action=="clarify</w:t>
+      </w:r>
+      <w:proofErr w:type="gramStart"/>
+      <w:r>
+        <w:t>"  "</w:t>
+      </w:r>
+      <w:proofErr w:type="gramEnd"/>
+      <w:r>
+        <w:t>reasoning": "brief explanation"}</w:t>
+      </w:r>
+    </w:p>
+    <w:p>
+      <w:pPr>
+        <w:pBdr>
+          <w:bottom w:val="single" w:sz="6" w:space="1" w:color="auto"/>
+        </w:pBdr>
+      </w:pPr>
+      <w:proofErr w:type="gramStart"/>
+      <w:r>
+        <w:t>Guidelines:-</w:t>
+      </w:r>
+      <w:proofErr w:type="gramEnd"/>
+      <w:r>
+        <w:t xml:space="preserve"> "retrieve": you need more information via the configured search </w:t>
+      </w:r>
+      <w:proofErr w:type="gramStart"/>
+      <w:r>
+        <w:t>method.-</w:t>
+      </w:r>
+      <w:proofErr w:type="gramEnd"/>
+      <w:r>
+        <w:t xml:space="preserve"> "clarify": the message is not really a </w:t>
+      </w:r>
+      <w:proofErr w:type="gramStart"/>
+      <w:r>
+        <w:t>question</w:t>
+      </w:r>
+      <w:proofErr w:type="gramEnd"/>
+      <w:r>
+        <w:t xml:space="preserve"> and you must ask for more input. Use ONLY as a last resort, and only AFTER attempting to query the </w:t>
+      </w:r>
+      <w:proofErr w:type="gramStart"/>
+      <w:r>
+        <w:t>database.-</w:t>
+      </w:r>
+      <w:proofErr w:type="gramEnd"/>
+      <w:r>
+        <w:t xml:space="preserve"> "answer": you have enough information, or the user asked to exit."</w:t>
+      </w:r>
+    </w:p>
+    <w:p>
+      <w:pPr>
+        <w:pBdr>
+          <w:bottom w:val="single" w:sz="6" w:space="1" w:color="auto"/>
+        </w:pBdr>
+      </w:pPr>
+    </w:p>
+    <w:p>
+      <w:r>
+        <w:rPr>
+          <w:b/>
+          <w:bCs/>
+        </w:rPr>
+        <w:t>Answer — Agentic Dynamic</w:t>
+      </w:r>
+    </w:p>
+    <w:p>
+      <w:pPr>
+        <w:pBdr>
+          <w:bottom w:val="single" w:sz="6" w:space="1" w:color="auto"/>
+        </w:pBdr>
+      </w:pPr>
+      <w:r>
+        <w:t xml:space="preserve">You are a helpful assistant for a Wikipedia retrieval engine. Answer the question using ONLY the provided Wikipedia article excerpts, and quote from them where you can. Consider any </w:t>
+      </w:r>
+      <w:proofErr w:type="gramStart"/>
+      <w:r>
+        <w:t>clarifications, which</w:t>
+      </w:r>
+      <w:proofErr w:type="gramEnd"/>
+      <w:r>
+        <w:t xml:space="preserve"> may add important details. If the retrieved excerpts do not contain enough information, say so explicitly and do not speculate or use outside knowledge. If the user is simply asking to exit, answer exactly: Exiting</w:t>
+      </w:r>
+    </w:p>
+    <w:p>
+      <w:pPr>
+        <w:pBdr>
+          <w:bottom w:val="single" w:sz="6" w:space="1" w:color="auto"/>
+        </w:pBdr>
+      </w:pPr>
+    </w:p>
+    <w:p>
+      <w:pPr>
+        <w:rPr>
+          <w:b/>
+          <w:bCs/>
+        </w:rPr>
+      </w:pPr>
+    </w:p>
+    <w:p>
+      <w:pPr>
+        <w:rPr>
+          <w:b/>
+          <w:bCs/>
+        </w:rPr>
+      </w:pPr>
+    </w:p>
+    <w:p>
+      <w:pPr>
+        <w:rPr>
+          <w:b/>
+          <w:bCs/>
+        </w:rPr>
+      </w:pPr>
+    </w:p>
+    <w:p>
+      <w:pPr>
+        <w:rPr>
+          <w:b/>
+          <w:bCs/>
+        </w:rPr>
+      </w:pPr>
+    </w:p>
+    <w:p>
+      <w:pPr>
+        <w:rPr>
+          <w:b/>
+          <w:bCs/>
+        </w:rPr>
+      </w:pPr>
+    </w:p>
+    <w:p>
+      <w:pPr>
+        <w:rPr>
+          <w:b/>
+          <w:bCs/>
+        </w:rPr>
+      </w:pPr>
+    </w:p>
+    <w:p>
+      <w:r>
+        <w:rPr>
+          <w:b/>
+          <w:bCs/>
+        </w:rPr>
+        <w:t>Answer — Context-Aware</w:t>
+      </w:r>
+    </w:p>
+    <w:p>
+      <w:r>
+        <w:t>You are a helpful assistant for a Wikipedia retrieval engine. Answer the question using ONLY the provided Wikipedia article excerpts, and quote from them where you can. Consider the prior conversation, which may add important context for resolving the current question. If the retrieved excerpts do not contain enough information, say so explicitly and do not speculate or use outside knowledge. If the user is simply asking to exit, answer exactly: Exiting</w:t>
+      </w:r>
+    </w:p>
+    <w:p>
+      <w:pPr>
+        <w:pBdr>
+          <w:bottom w:val="single" w:sz="6" w:space="1" w:color="auto"/>
+        </w:pBdr>
+      </w:pPr>
+    </w:p>
+    <w:p>
+      <w:r>
+        <w:rPr>
+          <w:b/>
+          <w:bCs/>
+        </w:rPr>
+        <w:t>RAGAS correctness judge</w:t>
+      </w:r>
+    </w:p>
+    <w:p>
+      <w:r>
+        <w:t>You are grading a retrieval-augmented answer against reference grading notes.</w:t>
+      </w:r>
+    </w:p>
+    <w:p>
+      <w:r>
+        <w:t>Return 'pass' if the response is factually consistent with the grading notes and captures their main point(</w:t>
+      </w:r>
+      <w:proofErr w:type="gramStart"/>
+      <w:r>
+        <w:t>s) —</w:t>
+      </w:r>
+      <w:proofErr w:type="gramEnd"/>
+      <w:r>
+        <w:t xml:space="preserve"> even if it omits some minor details or is worded differently. Return 'fail' only if the response contradicts the notes, is unsupported by them, or misses the central point.</w:t>
+      </w:r>
+    </w:p>
+    <w:p>
+      <w:proofErr w:type="gramStart"/>
+      <w:r>
+        <w:t>Response: {</w:t>
+      </w:r>
+      <w:proofErr w:type="gramEnd"/>
+      <w:r>
+        <w:t>response}</w:t>
+      </w:r>
+    </w:p>
+    <w:p>
+      <w:r>
+        <w:t xml:space="preserve">Grading </w:t>
+      </w:r>
+      <w:proofErr w:type="gramStart"/>
+      <w:r>
+        <w:t>Notes: {</w:t>
+      </w:r>
+      <w:proofErr w:type="spellStart"/>
+      <w:proofErr w:type="gramEnd"/>
+      <w:r>
+        <w:t>grading_notes</w:t>
+      </w:r>
+      <w:proofErr w:type="spellEnd"/>
+      <w:r>
+        <w:t>}</w:t>
+      </w:r>
+    </w:p>
+    <w:p>
+      <w:pPr>
+        <w:pBdr>
+          <w:bottom w:val="single" w:sz="6" w:space="1" w:color="auto"/>
+        </w:pBdr>
+      </w:pPr>
+    </w:p>
+    <w:p/>
+    <w:p>
+      <w:pPr>
+        <w:jc w:val="center"/>
+      </w:pPr>
+      <w:r>
+        <w:rPr>
+          <w:b/>
+          <w:bCs/>
+        </w:rPr>
+        <w:t xml:space="preserve">End of Required Capstone Checkpoint </w:t>
+      </w:r>
+      <w:r>
+        <w:rPr>
+          <w:b/>
+          <w:bCs/>
+        </w:rPr>
+        <w:t>5</w:t>
+      </w:r>
+      <w:r>
+        <w:rPr>
+          <w:b/>
+          <w:bCs/>
+        </w:rPr>
         <w:t>.1</w:t>
       </w:r>
     </w:p>
@@ -2821,10 +4383,10 @@
       </w:r>
     </w:p>
     <w:sectPr>
-      <w:headerReference w:type="even" r:id="rId8"/>
-      <w:headerReference w:type="default" r:id="rId9"/>
-      <w:footerReference w:type="default" r:id="rId10"/>
-      <w:headerReference w:type="first" r:id="rId11"/>
+      <w:headerReference w:type="even" r:id="rId12"/>
+      <w:headerReference w:type="default" r:id="rId13"/>
+      <w:footerReference w:type="default" r:id="rId14"/>
+      <w:headerReference w:type="first" r:id="rId15"/>
       <w:pgSz w:w="12240" w:h="15840"/>
       <w:pgMar w:top="1440" w:right="567" w:bottom="1440" w:left="567" w:header="57" w:footer="170" w:gutter="0"/>
       <w:pgNumType w:start="1"/>
@@ -6309,6 +7871,18 @@
       </w:tblBorders>
     </w:tblPr>
   </w:style>
+  <w:style w:type="character" w:styleId="UnresolvedMention">
+    <w:name w:val="Unresolved Mention"/>
+    <w:basedOn w:val="DefaultParagraphFont"/>
+    <w:uiPriority w:val="99"/>
+    <w:semiHidden/>
+    <w:unhideWhenUsed/>
+    <w:rsid w:val="00507673"/>
+    <w:rPr>
+      <w:color w:val="605E5C"/>
+      <w:shd w:val="clear" w:color="auto" w:fill="E1DFDD"/>
+    </w:rPr>
+  </w:style>
 </w:styles>
 </file>
 

</xml_diff>